<commit_message>
Deploying to gh-pages from @ Morrison-Lab/mds@7e96e69d67a27182ad7ace73f193989fa3a40e62 🚀
</commit_message>
<xml_diff>
--- a/calculus-derivatives.docx
+++ b/calculus-derivatives.docx
@@ -15,10 +15,10 @@
         <w:pStyle w:val="Date"/>
       </w:pPr>
       <w:r>
-        <w:t xml:space="preserve">Last modified: 2026-10-17 03:46:15 (PDT)</w:t>
+        <w:t xml:space="preserve">Last modified: 2026-10-17 04:46:25 (PDT)</w:t>
       </w:r>
     </w:p>
-    <w:bookmarkStart w:id="202" w:name="sec-derivatives"/>
+    <w:bookmarkStart w:id="203" w:name="sec-derivatives"/>
     <w:p>
       <w:pPr>
         <w:pStyle w:val="Heading2"/>
@@ -23600,7 +23600,7 @@
     </w:p>
     <w:bookmarkEnd w:id="108"/>
     <w:bookmarkEnd w:id="109"/>
-    <w:bookmarkStart w:id="119" w:name="sec-function-profile"/>
+    <w:bookmarkStart w:id="120" w:name="sec-function-profile"/>
     <w:p>
       <w:pPr>
         <w:pStyle w:val="Heading3"/>
@@ -23976,7 +23976,7 @@
       </w:r>
     </w:p>
     <w:bookmarkEnd w:id="110"/>
-    <w:bookmarkStart w:id="113" w:name="def-function-profile"/>
+    <w:bookmarkStart w:id="114" w:name="def-function-profile"/>
     <w:p>
       <w:pPr>
         <w:pStyle w:val="BodyText"/>
@@ -24383,7 +24383,24 @@
         <w:t xml:space="preserve"> </w:t>
       </w:r>
       <w:r>
-        <w:t xml:space="preserve">which exists on the range of</w:t>
+        <w:t xml:space="preserve">which exists on the</w:t>
+      </w:r>
+      <w:r>
+        <w:t xml:space="preserve"> </w:t>
+      </w:r>
+      <w:hyperlink r:id="rId112">
+        <w:r>
+          <w:rPr>
+            <w:rStyle w:val="Hyperlink"/>
+          </w:rPr>
+          <w:t xml:space="preserve">image</w:t>
+        </w:r>
+      </w:hyperlink>
+      <w:r>
+        <w:t xml:space="preserve"> </w:t>
+      </w:r>
+      <w:r>
+        <w:t xml:space="preserve">of</w:t>
       </w:r>
       <w:r>
         <w:t xml:space="preserve"> </w:t>
@@ -24715,7 +24732,7 @@
       <w:r>
         <w:t xml:space="preserve">(</w:t>
       </w:r>
-      <w:hyperlink r:id="rId112">
+      <w:hyperlink r:id="rId113">
         <w:r>
           <w:rPr>
             <w:rStyle w:val="Hyperlink"/>
@@ -24927,8 +24944,8 @@
         <w:t xml:space="preserve">.</w:t>
       </w:r>
     </w:p>
-    <w:bookmarkEnd w:id="113"/>
-    <w:bookmarkStart w:id="118" w:name="exm-function-profile-logistic"/>
+    <w:bookmarkEnd w:id="114"/>
+    <w:bookmarkStart w:id="119" w:name="exm-function-profile-logistic"/>
     <w:p>
       <w:pPr>
         <w:pStyle w:val="FirstParagraph"/>
@@ -30588,7 +30605,7 @@
       <w:tr>
         <w:tc>
           <w:tcPr/>
-          <w:bookmarkStart w:id="117" w:name="fig-function-profile-logistic"/>
+          <w:bookmarkStart w:id="118" w:name="fig-function-profile-logistic"/>
           <w:p>
             <w:pPr>
               <w:pStyle w:val="Compact"/>
@@ -30599,18 +30616,18 @@
                 <wp:inline>
                   <wp:extent cx="4620126" cy="3696101"/>
                   <wp:effectExtent b="0" l="0" r="0" t="0"/>
-                  <wp:docPr descr="" title="" id="115" name="Picture"/>
+                  <wp:docPr descr="" title="" id="116" name="Picture"/>
                   <a:graphic>
                     <a:graphicData uri="http://schemas.openxmlformats.org/drawingml/2006/picture">
                       <pic:pic>
                         <pic:nvPicPr>
-                          <pic:cNvPr descr="calculus-derivatives_files/figure-docx/fig-function-profile-logistic-1.png" id="116" name="Picture"/>
+                          <pic:cNvPr descr="calculus-derivatives_files/figure-docx/fig-function-profile-logistic-1.png" id="117" name="Picture"/>
                           <pic:cNvPicPr>
                             <a:picLocks noChangeArrowheads="1" noChangeAspect="1"/>
                           </pic:cNvPicPr>
                         </pic:nvPicPr>
                         <pic:blipFill>
-                          <a:blip r:embed="rId114"/>
+                          <a:blip r:embed="rId115"/>
                           <a:stretch>
                             <a:fillRect/>
                           </a:stretch>
@@ -30650,13 +30667,13 @@
               <w:t xml:space="preserve">Figure 1: The logistic function, its derivative and its logarithm</w:t>
             </w:r>
           </w:p>
-          <w:bookmarkEnd w:id="117"/>
+          <w:bookmarkEnd w:id="118"/>
         </w:tc>
       </w:tr>
     </w:tbl>
-    <w:bookmarkEnd w:id="118"/>
     <w:bookmarkEnd w:id="119"/>
-    <w:bookmarkStart w:id="124" w:name="sec-tangent-lines"/>
+    <w:bookmarkEnd w:id="120"/>
+    <w:bookmarkStart w:id="125" w:name="sec-tangent-lines"/>
     <w:p>
       <w:pPr>
         <w:pStyle w:val="Heading3"/>
@@ -30665,7 +30682,7 @@
         <w:t xml:space="preserve">1.4 Tangent lines</w:t>
       </w:r>
     </w:p>
-    <w:bookmarkStart w:id="122" w:name="def-tangent-line"/>
+    <w:bookmarkStart w:id="123" w:name="def-tangent-line"/>
     <w:p>
       <w:pPr>
         <w:pStyle w:val="FirstParagraph"/>
@@ -30747,7 +30764,7 @@
       <w:r>
         <w:t xml:space="preserve"> </w:t>
       </w:r>
-      <w:hyperlink r:id="rId120">
+      <w:hyperlink r:id="rId121">
         <w:r>
           <w:rPr>
             <w:rStyle w:val="Hyperlink"/>
@@ -30792,7 +30809,7 @@
       <w:r>
         <w:t xml:space="preserve"> </w:t>
       </w:r>
-      <w:hyperlink r:id="rId121">
+      <w:hyperlink r:id="rId122">
         <w:r>
           <w:rPr>
             <w:rStyle w:val="Hyperlink"/>
@@ -31104,8 +31121,8 @@
         <w:t xml:space="preserve">.</w:t>
       </w:r>
     </w:p>
-    <w:bookmarkEnd w:id="122"/>
-    <w:bookmarkStart w:id="123" w:name="exm-tangent-line"/>
+    <w:bookmarkEnd w:id="123"/>
+    <w:bookmarkStart w:id="124" w:name="exm-tangent-line"/>
     <w:p>
       <w:pPr>
         <w:pStyle w:val="BodyText"/>
@@ -31769,9 +31786,9 @@
         <w:t xml:space="preserve">.</w:t>
       </w:r>
     </w:p>
-    <w:bookmarkEnd w:id="123"/>
     <w:bookmarkEnd w:id="124"/>
-    <w:bookmarkStart w:id="133" w:name="sec-linear-approximation"/>
+    <w:bookmarkEnd w:id="125"/>
+    <w:bookmarkStart w:id="134" w:name="sec-linear-approximation"/>
     <w:p>
       <w:pPr>
         <w:pStyle w:val="Heading3"/>
@@ -31817,7 +31834,7 @@
       <w:pPr>
         <w:pStyle w:val="BodyText"/>
       </w:pPr>
-      <w:bookmarkStart w:id="125" w:name="eq-linear-approx"/>
+      <w:bookmarkStart w:id="126" w:name="eq-linear-approx"/>
       <m:oMathPara>
         <m:oMathParaPr>
           <m:jc m:val="center"/>
@@ -31942,9 +31959,9 @@
           </m:r>
         </m:oMath>
       </m:oMathPara>
-      <w:bookmarkEnd w:id="125"/>
+      <w:bookmarkEnd w:id="126"/>
     </w:p>
-    <w:bookmarkStart w:id="126" w:name="def-linear-approximation"/>
+    <w:bookmarkStart w:id="127" w:name="def-linear-approximation"/>
     <w:p>
       <w:pPr>
         <w:pStyle w:val="FirstParagraph"/>
@@ -32314,8 +32331,8 @@
         <w:t xml:space="preserve">illustrates this approximation interactively for a quadratic function.</w:t>
       </w:r>
     </w:p>
-    <w:bookmarkEnd w:id="126"/>
-    <w:bookmarkStart w:id="129" w:name="rem-linear-approx-affine"/>
+    <w:bookmarkEnd w:id="127"/>
+    <w:bookmarkStart w:id="130" w:name="rem-linear-approx-affine"/>
     <w:p>
       <w:pPr>
         <w:pStyle w:val="BodyText"/>
@@ -32395,7 +32412,7 @@
       <w:r>
         <w:t xml:space="preserve"> </w:t>
       </w:r>
-      <w:hyperlink r:id="rId121">
+      <w:hyperlink r:id="rId122">
         <w:r>
           <w:rPr>
             <w:rStyle w:val="Hyperlink"/>
@@ -32508,7 +32525,7 @@
       <w:r>
         <w:t xml:space="preserve"> </w:t>
       </w:r>
-      <w:hyperlink r:id="rId127">
+      <w:hyperlink r:id="rId128">
         <w:r>
           <w:rPr>
             <w:rStyle w:val="Hyperlink"/>
@@ -32607,7 +32624,7 @@
       <w:r>
         <w:t xml:space="preserve">(</w:t>
       </w:r>
-      <w:hyperlink r:id="rId128">
+      <w:hyperlink r:id="rId129">
         <w:r>
           <w:rPr>
             <w:rStyle w:val="Hyperlink"/>
@@ -32634,7 +32651,7 @@
         <w:t xml:space="preserve">as an affine function for functions of several variables as well.</w:t>
       </w:r>
     </w:p>
-    <w:bookmarkEnd w:id="129"/>
+    <w:bookmarkEnd w:id="130"/>
     <w:tbl>
       <w:tblPr>
         <w:tblStyle w:val="Table"/>
@@ -32648,7 +32665,7 @@
       <w:tr>
         <w:tc>
           <w:tcPr/>
-          <w:bookmarkStart w:id="130" w:name="fig-linear-approx"/>
+          <w:bookmarkStart w:id="131" w:name="fig-linear-approx"/>
           <w:p>
             <w:pPr>
               <w:jc w:val="center"/>
@@ -32781,11 +32798,11 @@
               <w:t xml:space="preserve">.</w:t>
             </w:r>
           </w:p>
-          <w:bookmarkEnd w:id="130"/>
+          <w:bookmarkEnd w:id="131"/>
         </w:tc>
       </w:tr>
     </w:tbl>
-    <w:bookmarkStart w:id="131" w:name="exr-miller-deriv-tangent-line-approx"/>
+    <w:bookmarkStart w:id="132" w:name="exr-miller-deriv-tangent-line-approx"/>
     <w:p>
       <w:pPr>
         <w:pStyle w:val="BodyText"/>
@@ -33070,8 +33087,8 @@
         <w:t xml:space="preserve">, and compare that approximation with the exact value.</w:t>
       </w:r>
     </w:p>
-    <w:bookmarkEnd w:id="131"/>
-    <w:bookmarkStart w:id="132" w:name="sol-miller-deriv-tangent-line-approx"/>
+    <w:bookmarkEnd w:id="132"/>
+    <w:bookmarkStart w:id="133" w:name="sol-miller-deriv-tangent-line-approx"/>
     <w:p>
       <w:pPr>
         <w:pStyle w:val="FirstParagraph"/>
@@ -34429,9 +34446,9 @@
         <w:t xml:space="preserve">.</w:t>
       </w:r>
     </w:p>
-    <w:bookmarkEnd w:id="132"/>
     <w:bookmarkEnd w:id="133"/>
-    <w:bookmarkStart w:id="149" w:name="sec-critical-points"/>
+    <w:bookmarkEnd w:id="134"/>
+    <w:bookmarkStart w:id="150" w:name="sec-critical-points"/>
     <w:p>
       <w:pPr>
         <w:pStyle w:val="Heading3"/>
@@ -34440,7 +34457,7 @@
         <w:t xml:space="preserve">1.6 Critical points and optimization</w:t>
       </w:r>
     </w:p>
-    <w:bookmarkStart w:id="134" w:name="def-flat-point"/>
+    <w:bookmarkStart w:id="135" w:name="def-flat-point"/>
     <w:p>
       <w:pPr>
         <w:pStyle w:val="FirstParagraph"/>
@@ -34608,8 +34625,8 @@
         <w:t xml:space="preserve">).</w:t>
       </w:r>
     </w:p>
-    <w:bookmarkEnd w:id="134"/>
-    <w:bookmarkStart w:id="137" w:name="exm-flat-point"/>
+    <w:bookmarkEnd w:id="135"/>
+    <w:bookmarkStart w:id="138" w:name="exm-flat-point"/>
     <w:p>
       <w:pPr>
         <w:pStyle w:val="BodyText"/>
@@ -34834,7 +34851,7 @@
       <w:r>
         <w:t xml:space="preserve"> </w:t>
       </w:r>
-      <w:hyperlink r:id="rId135">
+      <w:hyperlink r:id="rId136">
         <w:r>
           <w:rPr>
             <w:rStyle w:val="Hyperlink"/>
@@ -34851,7 +34868,7 @@
       <w:r>
         <w:t xml:space="preserve"> </w:t>
       </w:r>
-      <w:hyperlink r:id="rId136">
+      <w:hyperlink r:id="rId137">
         <w:r>
           <w:rPr>
             <w:rStyle w:val="Hyperlink"/>
@@ -35133,8 +35150,8 @@
         <w:t xml:space="preserve">is not a flat point.</w:t>
       </w:r>
     </w:p>
-    <w:bookmarkEnd w:id="137"/>
-    <w:bookmarkStart w:id="138" w:name="exr-flat-point"/>
+    <w:bookmarkEnd w:id="138"/>
+    <w:bookmarkStart w:id="139" w:name="exr-flat-point"/>
     <w:p>
       <w:pPr>
         <w:pStyle w:val="FirstParagraph"/>
@@ -35309,7 +35326,7 @@
       <w:r>
         <w:t xml:space="preserve"> </w:t>
       </w:r>
-      <w:hyperlink r:id="rId135">
+      <w:hyperlink r:id="rId136">
         <w:r>
           <w:rPr>
             <w:rStyle w:val="Hyperlink"/>
@@ -35326,7 +35343,7 @@
       <w:r>
         <w:t xml:space="preserve"> </w:t>
       </w:r>
-      <w:hyperlink r:id="rId136">
+      <w:hyperlink r:id="rId137">
         <w:r>
           <w:rPr>
             <w:rStyle w:val="Hyperlink"/>
@@ -35427,8 +35444,8 @@
         <w:t xml:space="preserve">, and compare that prediction with the exact value.</w:t>
       </w:r>
     </w:p>
-    <w:bookmarkEnd w:id="138"/>
-    <w:bookmarkStart w:id="140" w:name="sol-flat-point"/>
+    <w:bookmarkEnd w:id="139"/>
+    <w:bookmarkStart w:id="141" w:name="sol-flat-point"/>
     <w:p>
       <w:pPr>
         <w:pStyle w:val="FirstParagraph"/>
@@ -36630,7 +36647,7 @@
       <w:r>
         <w:t xml:space="preserve"> </w:t>
       </w:r>
-      <w:hyperlink r:id="rId139">
+      <w:hyperlink r:id="rId140">
         <w:r>
           <w:rPr>
             <w:rStyle w:val="Hyperlink"/>
@@ -36660,8 +36677,8 @@
         <w:t xml:space="preserve">and the recommendation is trustworthy only as far as the step is small.</w:t>
       </w:r>
     </w:p>
-    <w:bookmarkEnd w:id="140"/>
-    <w:bookmarkStart w:id="141" w:name="def-critical-point"/>
+    <w:bookmarkEnd w:id="141"/>
+    <w:bookmarkStart w:id="142" w:name="def-critical-point"/>
     <w:p>
       <w:pPr>
         <w:pStyle w:val="BodyText"/>
@@ -36861,8 +36878,8 @@
         <w:t xml:space="preserve">).</w:t>
       </w:r>
     </w:p>
-    <w:bookmarkEnd w:id="141"/>
-    <w:bookmarkStart w:id="142" w:name="exm-critical-point"/>
+    <w:bookmarkEnd w:id="142"/>
+    <w:bookmarkStart w:id="143" w:name="exm-critical-point"/>
     <w:p>
       <w:pPr>
         <w:pStyle w:val="BodyText"/>
@@ -37563,8 +37580,8 @@
         <w:t xml:space="preserve">is not one.</w:t>
       </w:r>
     </w:p>
-    <w:bookmarkEnd w:id="142"/>
-    <w:bookmarkStart w:id="143" w:name="thm-flat-point-critical"/>
+    <w:bookmarkEnd w:id="143"/>
+    <w:bookmarkStart w:id="144" w:name="thm-flat-point-critical"/>
     <w:p>
       <w:pPr>
         <w:pStyle w:val="FirstParagraph"/>
@@ -37661,7 +37678,7 @@
         <w:t xml:space="preserve">).</w:t>
       </w:r>
     </w:p>
-    <w:bookmarkEnd w:id="143"/>
+    <w:bookmarkEnd w:id="144"/>
     <w:p>
       <w:pPr>
         <w:pStyle w:val="BodyText"/>
@@ -37865,7 +37882,7 @@
         <w:t xml:space="preserve">is a critical point.</w:t>
       </w:r>
     </w:p>
-    <w:bookmarkStart w:id="144" w:name="exm-flat-point-critical"/>
+    <w:bookmarkStart w:id="145" w:name="exm-flat-point-critical"/>
     <w:p>
       <w:pPr>
         <w:pStyle w:val="BodyText"/>
@@ -38951,8 +38968,8 @@
         <w:t xml:space="preserve">), but not a flat point.</w:t>
       </w:r>
     </w:p>
-    <w:bookmarkEnd w:id="144"/>
-    <w:bookmarkStart w:id="145" w:name="exr-miller-deriv-opt-gamma-kernel"/>
+    <w:bookmarkEnd w:id="145"/>
+    <w:bookmarkStart w:id="146" w:name="exr-miller-deriv-opt-gamma-kernel"/>
     <w:p>
       <w:pPr>
         <w:pStyle w:val="BodyText"/>
@@ -39097,8 +39114,8 @@
         <w:t xml:space="preserve">.</w:t>
       </w:r>
     </w:p>
-    <w:bookmarkEnd w:id="145"/>
-    <w:bookmarkStart w:id="146" w:name="sol-miller-deriv-opt-gamma-kernel"/>
+    <w:bookmarkEnd w:id="146"/>
+    <w:bookmarkStart w:id="147" w:name="sol-miller-deriv-opt-gamma-kernel"/>
     <w:p>
       <w:pPr>
         <w:pStyle w:val="BodyText"/>
@@ -39982,8 +39999,8 @@
         <w:t xml:space="preserve">.</w:t>
       </w:r>
     </w:p>
-    <w:bookmarkEnd w:id="146"/>
-    <w:bookmarkStart w:id="147" w:name="X2af8583915c3d6755df2ace9fe2e1b48908f679"/>
+    <w:bookmarkEnd w:id="147"/>
+    <w:bookmarkStart w:id="148" w:name="X2af8583915c3d6755df2ace9fe2e1b48908f679"/>
     <w:p>
       <w:pPr>
         <w:pStyle w:val="BodyText"/>
@@ -40099,8 +40116,8 @@
         <w:t xml:space="preserve">and decide whether each is a local maximum, a local minimum, or an inflection point.</w:t>
       </w:r>
     </w:p>
-    <w:bookmarkEnd w:id="147"/>
-    <w:bookmarkStart w:id="148" w:name="X9a58de6c6ab4baf2df3e3111c406b3abe7c25e0"/>
+    <w:bookmarkEnd w:id="148"/>
+    <w:bookmarkStart w:id="149" w:name="X9a58de6c6ab4baf2df3e3111c406b3abe7c25e0"/>
     <w:p>
       <w:pPr>
         <w:pStyle w:val="BodyText"/>
@@ -40877,9 +40894,9 @@
         <w:t xml:space="preserve">is non-zero at both critical points, neither is an inflection point.</w:t>
       </w:r>
     </w:p>
-    <w:bookmarkEnd w:id="148"/>
     <w:bookmarkEnd w:id="149"/>
-    <w:bookmarkStart w:id="201" w:name="sec-taylor-series"/>
+    <w:bookmarkEnd w:id="150"/>
+    <w:bookmarkStart w:id="202" w:name="sec-taylor-series"/>
     <w:p>
       <w:pPr>
         <w:pStyle w:val="Heading3"/>
@@ -40888,7 +40905,7 @@
         <w:t xml:space="preserve">1.7 Taylor series</w:t>
       </w:r>
     </w:p>
-    <w:bookmarkStart w:id="151" w:name="def-taylor-polynomial"/>
+    <w:bookmarkStart w:id="152" w:name="def-taylor-polynomial"/>
     <w:p>
       <w:pPr>
         <w:pStyle w:val="FirstParagraph"/>
@@ -41032,7 +41049,7 @@
       <w:pPr>
         <w:pStyle w:val="BodyText"/>
       </w:pPr>
-      <w:bookmarkStart w:id="150" w:name="eq-taylor-poly-def"/>
+      <w:bookmarkStart w:id="151" w:name="eq-taylor-poly-def"/>
       <m:oMathPara>
         <m:oMathParaPr>
           <m:jc m:val="center"/>
@@ -41582,10 +41599,10 @@
           </m:r>
         </m:oMath>
       </m:oMathPara>
-      <w:bookmarkEnd w:id="150"/>
+      <w:bookmarkEnd w:id="151"/>
     </w:p>
-    <w:bookmarkEnd w:id="151"/>
-    <w:bookmarkStart w:id="152" w:name="exm-taylor-polynomial-exponential"/>
+    <w:bookmarkEnd w:id="152"/>
+    <w:bookmarkStart w:id="153" w:name="exm-taylor-polynomial-exponential"/>
     <w:p>
       <w:pPr>
         <w:pStyle w:val="FirstParagraph"/>
@@ -42230,8 +42247,8 @@
         </m:oMath>
       </m:oMathPara>
     </w:p>
-    <w:bookmarkEnd w:id="152"/>
-    <w:bookmarkStart w:id="153" w:name="def-maclaurin-polynomial"/>
+    <w:bookmarkEnd w:id="153"/>
+    <w:bookmarkStart w:id="154" w:name="def-maclaurin-polynomial"/>
     <w:p>
       <w:pPr>
         <w:pStyle w:val="FirstParagraph"/>
@@ -42341,8 +42358,8 @@
         <w:t xml:space="preserve">.</w:t>
       </w:r>
     </w:p>
-    <w:bookmarkEnd w:id="153"/>
-    <w:bookmarkStart w:id="154" w:name="def-taylor-series"/>
+    <w:bookmarkEnd w:id="154"/>
+    <w:bookmarkStart w:id="155" w:name="def-taylor-series"/>
     <w:p>
       <w:pPr>
         <w:pStyle w:val="BodyText"/>
@@ -42682,7 +42699,7 @@
         <w:t xml:space="preserve">.</w:t>
       </w:r>
     </w:p>
-    <w:bookmarkEnd w:id="154"/>
+    <w:bookmarkEnd w:id="155"/>
     <w:tbl>
       <w:tblPr>
         <w:tblStyle w:val="Table"/>
@@ -42724,12 +42741,12 @@
                 <wp:inline>
                   <wp:extent cx="152400" cy="152400"/>
                   <wp:effectExtent b="0" l="0" r="0" t="0"/>
-                  <wp:docPr descr="" title="" id="155" name="Picture"/>
+                  <wp:docPr descr="" title="" id="156" name="Picture"/>
                   <a:graphic>
                     <a:graphicData uri="http://schemas.openxmlformats.org/drawingml/2006/picture">
                       <pic:pic>
                         <pic:nvPicPr>
-                          <pic:cNvPr descr="/opt/quarto/share/formats/docx/tip.png" id="156" name="Picture"/>
+                          <pic:cNvPr descr="/opt/quarto/share/formats/docx/tip.png" id="157" name="Picture"/>
                           <pic:cNvPicPr>
                             <a:picLocks noChangeArrowheads="1" noChangeAspect="1"/>
                           </pic:cNvPicPr>
@@ -42797,7 +42814,7 @@
             <w:r>
               <w:t xml:space="preserve"> </w:t>
             </w:r>
-            <w:hyperlink r:id="rId157">
+            <w:hyperlink r:id="rId158">
               <w:r>
                 <w:rPr>
                   <w:rStyle w:val="Hyperlink"/>
@@ -42828,7 +42845,7 @@
                 <w:numId w:val="1020"/>
               </w:numPr>
             </w:pPr>
-            <w:hyperlink r:id="rId158">
+            <w:hyperlink r:id="rId159">
               <w:r>
                 <w:rPr>
                   <w:rStyle w:val="Hyperlink"/>
@@ -42858,7 +42875,7 @@
         </w:tc>
       </w:tr>
     </w:tbl>
-    <w:bookmarkStart w:id="159" w:name="exr-miller-taylor-poly-zero"/>
+    <w:bookmarkStart w:id="160" w:name="exr-miller-taylor-poly-zero"/>
     <w:p>
       <w:pPr>
         <w:pStyle w:val="FirstParagraph"/>
@@ -43006,8 +43023,8 @@
         <w:t xml:space="preserve">.</w:t>
       </w:r>
     </w:p>
-    <w:bookmarkEnd w:id="159"/>
-    <w:bookmarkStart w:id="160" w:name="sol-miller-taylor-poly-zero"/>
+    <w:bookmarkEnd w:id="160"/>
+    <w:bookmarkStart w:id="161" w:name="sol-miller-taylor-poly-zero"/>
     <w:p>
       <w:pPr>
         <w:pStyle w:val="BodyText"/>
@@ -43961,8 +43978,8 @@
         <w:t xml:space="preserve">, its Taylor polynomial of degree 4 simply collects its terms of degree at most 4.</w:t>
       </w:r>
     </w:p>
-    <w:bookmarkEnd w:id="160"/>
-    <w:bookmarkStart w:id="161" w:name="exr-miller-taylor-poly-nonzero"/>
+    <w:bookmarkEnd w:id="161"/>
+    <w:bookmarkStart w:id="162" w:name="exr-miller-taylor-poly-nonzero"/>
     <w:p>
       <w:pPr>
         <w:pStyle w:val="BodyText"/>
@@ -44110,8 +44127,8 @@
         <w:t xml:space="preserve">.</w:t>
       </w:r>
     </w:p>
-    <w:bookmarkEnd w:id="161"/>
-    <w:bookmarkStart w:id="162" w:name="sol-miller-taylor-poly-nonzero"/>
+    <w:bookmarkEnd w:id="162"/>
+    <w:bookmarkStart w:id="163" w:name="sol-miller-taylor-poly-nonzero"/>
     <w:p>
       <w:pPr>
         <w:pStyle w:val="BodyText"/>
@@ -44813,8 +44830,8 @@
         </m:oMath>
       </m:oMathPara>
     </w:p>
-    <w:bookmarkEnd w:id="162"/>
-    <w:bookmarkStart w:id="163" w:name="exm-taylor-polynomial-cosine"/>
+    <w:bookmarkEnd w:id="163"/>
+    <w:bookmarkStart w:id="164" w:name="exm-taylor-polynomial-cosine"/>
     <w:p>
       <w:pPr>
         <w:pStyle w:val="FirstParagraph"/>
@@ -45743,8 +45760,8 @@
         </m:oMath>
       </m:oMathPara>
     </w:p>
-    <w:bookmarkEnd w:id="163"/>
-    <w:bookmarkStart w:id="164" w:name="exm-taylor-polynomial-sine"/>
+    <w:bookmarkEnd w:id="164"/>
+    <w:bookmarkStart w:id="165" w:name="exm-taylor-polynomial-sine"/>
     <w:p>
       <w:pPr>
         <w:pStyle w:val="FirstParagraph"/>
@@ -46349,8 +46366,8 @@
         </m:oMath>
       </m:oMathPara>
     </w:p>
-    <w:bookmarkEnd w:id="164"/>
-    <w:bookmarkStart w:id="165" w:name="exr-miller-taylor-cos-scaled"/>
+    <w:bookmarkEnd w:id="165"/>
+    <w:bookmarkStart w:id="166" w:name="exr-miller-taylor-cos-scaled"/>
     <w:p>
       <w:pPr>
         <w:pStyle w:val="FirstParagraph"/>
@@ -46483,8 +46500,8 @@
         <w:t xml:space="preserve">.</w:t>
       </w:r>
     </w:p>
-    <w:bookmarkEnd w:id="165"/>
-    <w:bookmarkStart w:id="166" w:name="sol-miller-taylor-cos-scaled"/>
+    <w:bookmarkEnd w:id="166"/>
+    <w:bookmarkStart w:id="167" w:name="sol-miller-taylor-cos-scaled"/>
     <w:p>
       <w:pPr>
         <w:pStyle w:val="BodyText"/>
@@ -46924,8 +46941,8 @@
         <w:t xml:space="preserve">Substituting into known Taylor expansions avoids computing high-order derivatives by hand.</w:t>
       </w:r>
     </w:p>
-    <w:bookmarkEnd w:id="166"/>
-    <w:bookmarkStart w:id="167" w:name="exr-miller-taylor-cos-cubed"/>
+    <w:bookmarkEnd w:id="167"/>
+    <w:bookmarkStart w:id="168" w:name="exr-miller-taylor-cos-cubed"/>
     <w:p>
       <w:pPr>
         <w:pStyle w:val="BodyText"/>
@@ -47067,8 +47084,8 @@
         <w:t xml:space="preserve">.</w:t>
       </w:r>
     </w:p>
-    <w:bookmarkEnd w:id="167"/>
-    <w:bookmarkStart w:id="168" w:name="sol-miller-taylor-cos-cubed"/>
+    <w:bookmarkEnd w:id="168"/>
+    <w:bookmarkStart w:id="169" w:name="sol-miller-taylor-cos-cubed"/>
     <w:p>
       <w:pPr>
         <w:pStyle w:val="BodyText"/>
@@ -47991,8 +48008,8 @@
         </m:oMath>
       </m:oMathPara>
     </w:p>
-    <w:bookmarkEnd w:id="168"/>
-    <w:bookmarkStart w:id="169" w:name="exr-miller-taylor-exp-base"/>
+    <w:bookmarkEnd w:id="169"/>
+    <w:bookmarkStart w:id="170" w:name="exr-miller-taylor-exp-base"/>
     <w:p>
       <w:pPr>
         <w:pStyle w:val="FirstParagraph"/>
@@ -48113,8 +48130,8 @@
         <w:t xml:space="preserve">.</w:t>
       </w:r>
     </w:p>
-    <w:bookmarkEnd w:id="169"/>
-    <w:bookmarkStart w:id="170" w:name="sol-miller-taylor-exp-base"/>
+    <w:bookmarkEnd w:id="170"/>
+    <w:bookmarkStart w:id="171" w:name="sol-miller-taylor-exp-base"/>
     <w:p>
       <w:pPr>
         <w:pStyle w:val="BodyText"/>
@@ -48637,8 +48654,8 @@
         </m:oMath>
       </m:oMathPara>
     </w:p>
-    <w:bookmarkEnd w:id="170"/>
-    <w:bookmarkStart w:id="171" w:name="exr-miller-taylor-exp-power"/>
+    <w:bookmarkEnd w:id="171"/>
+    <w:bookmarkStart w:id="172" w:name="exr-miller-taylor-exp-power"/>
     <w:p>
       <w:pPr>
         <w:pStyle w:val="FirstParagraph"/>
@@ -48781,8 +48798,8 @@
         <w:t xml:space="preserve">.</w:t>
       </w:r>
     </w:p>
-    <w:bookmarkEnd w:id="171"/>
-    <w:bookmarkStart w:id="172" w:name="sol-miller-taylor-exp-power"/>
+    <w:bookmarkEnd w:id="172"/>
+    <w:bookmarkStart w:id="173" w:name="sol-miller-taylor-exp-power"/>
     <w:p>
       <w:pPr>
         <w:pStyle w:val="BodyText"/>
@@ -49322,8 +49339,8 @@
         </m:oMath>
       </m:oMathPara>
     </w:p>
-    <w:bookmarkEnd w:id="172"/>
-    <w:bookmarkStart w:id="173" w:name="exr-miller-taylor-normal-density"/>
+    <w:bookmarkEnd w:id="173"/>
+    <w:bookmarkStart w:id="174" w:name="exr-miller-taylor-normal-density"/>
     <w:p>
       <w:pPr>
         <w:pStyle w:val="FirstParagraph"/>
@@ -49510,8 +49527,8 @@
         <w:t xml:space="preserve">.</w:t>
       </w:r>
     </w:p>
-    <w:bookmarkEnd w:id="173"/>
-    <w:bookmarkStart w:id="174" w:name="sol-miller-taylor-normal-density"/>
+    <w:bookmarkEnd w:id="174"/>
+    <w:bookmarkStart w:id="175" w:name="sol-miller-taylor-normal-density"/>
     <w:p>
       <w:pPr>
         <w:pStyle w:val="BodyText"/>
@@ -50085,8 +50102,8 @@
         </m:oMath>
       </m:oMathPara>
     </w:p>
-    <w:bookmarkEnd w:id="174"/>
-    <w:bookmarkStart w:id="175" w:name="thm-taylor-normal-density"/>
+    <w:bookmarkEnd w:id="175"/>
+    <w:bookmarkStart w:id="176" w:name="thm-taylor-normal-density"/>
     <w:p>
       <w:pPr>
         <w:pStyle w:val="FirstParagraph"/>
@@ -50344,7 +50361,7 @@
         </m:oMath>
       </m:oMathPara>
     </w:p>
-    <w:bookmarkEnd w:id="175"/>
+    <w:bookmarkEnd w:id="176"/>
     <w:p>
       <w:pPr>
         <w:pStyle w:val="FirstParagraph"/>
@@ -50391,7 +50408,7 @@
         <w:t xml:space="preserve">.</w:t>
       </w:r>
     </w:p>
-    <w:bookmarkStart w:id="176" w:name="exr-miller-taylor-sqrt"/>
+    <w:bookmarkStart w:id="177" w:name="exr-miller-taylor-sqrt"/>
     <w:p>
       <w:pPr>
         <w:pStyle w:val="BodyText"/>
@@ -50520,8 +50537,8 @@
         <w:t xml:space="preserve">.</w:t>
       </w:r>
     </w:p>
-    <w:bookmarkEnd w:id="176"/>
-    <w:bookmarkStart w:id="177" w:name="sol-miller-taylor-sqrt"/>
+    <w:bookmarkEnd w:id="177"/>
+    <w:bookmarkStart w:id="178" w:name="sol-miller-taylor-sqrt"/>
     <w:p>
       <w:pPr>
         <w:pStyle w:val="BodyText"/>
@@ -51401,8 +51418,8 @@
         </m:oMath>
       </m:oMathPara>
     </w:p>
-    <w:bookmarkEnd w:id="177"/>
-    <w:bookmarkStart w:id="178" w:name="exr-miller-taylor-cube-root"/>
+    <w:bookmarkEnd w:id="178"/>
+    <w:bookmarkStart w:id="179" w:name="exr-miller-taylor-cube-root"/>
     <w:p>
       <w:pPr>
         <w:pStyle w:val="FirstParagraph"/>
@@ -51562,8 +51579,8 @@
         <w:t xml:space="preserve">.</w:t>
       </w:r>
     </w:p>
-    <w:bookmarkEnd w:id="178"/>
-    <w:bookmarkStart w:id="179" w:name="sol-miller-taylor-cube-root"/>
+    <w:bookmarkEnd w:id="179"/>
+    <w:bookmarkStart w:id="180" w:name="sol-miller-taylor-cube-root"/>
     <w:p>
       <w:pPr>
         <w:pStyle w:val="BodyText"/>
@@ -52875,8 +52892,8 @@
         </m:oMath>
       </m:oMathPara>
     </w:p>
-    <w:bookmarkEnd w:id="179"/>
-    <w:bookmarkStart w:id="180" w:name="exr-miller-taylor-x-log-x"/>
+    <w:bookmarkEnd w:id="180"/>
+    <w:bookmarkStart w:id="181" w:name="exr-miller-taylor-x-log-x"/>
     <w:p>
       <w:pPr>
         <w:pStyle w:val="FirstParagraph"/>
@@ -53025,8 +53042,8 @@
         <w:t xml:space="preserve">.</w:t>
       </w:r>
     </w:p>
-    <w:bookmarkEnd w:id="180"/>
-    <w:bookmarkStart w:id="181" w:name="sol-miller-taylor-x-log-x"/>
+    <w:bookmarkEnd w:id="181"/>
+    <w:bookmarkStart w:id="182" w:name="sol-miller-taylor-x-log-x"/>
     <w:p>
       <w:pPr>
         <w:pStyle w:val="BodyText"/>
@@ -53690,8 +53707,8 @@
         </m:oMath>
       </m:oMathPara>
     </w:p>
-    <w:bookmarkEnd w:id="181"/>
-    <w:bookmarkStart w:id="182" w:name="exr-miller-taylor-log-one-plus-x"/>
+    <w:bookmarkEnd w:id="182"/>
+    <w:bookmarkStart w:id="183" w:name="exr-miller-taylor-log-one-plus-x"/>
     <w:p>
       <w:pPr>
         <w:pStyle w:val="FirstParagraph"/>
@@ -53876,8 +53893,8 @@
         <w:t xml:space="preserve">.</w:t>
       </w:r>
     </w:p>
-    <w:bookmarkEnd w:id="182"/>
-    <w:bookmarkStart w:id="183" w:name="sol-miller-taylor-log-one-plus-x"/>
+    <w:bookmarkEnd w:id="183"/>
+    <w:bookmarkStart w:id="184" w:name="sol-miller-taylor-log-one-plus-x"/>
     <w:p>
       <w:pPr>
         <w:pStyle w:val="BodyText"/>
@@ -54497,8 +54514,8 @@
         </m:oMath>
       </m:oMathPara>
     </w:p>
-    <w:bookmarkEnd w:id="183"/>
-    <w:bookmarkStart w:id="184" w:name="thm-taylor-log-one-plus-x"/>
+    <w:bookmarkEnd w:id="184"/>
+    <w:bookmarkStart w:id="185" w:name="thm-taylor-log-one-plus-x"/>
     <w:p>
       <w:pPr>
         <w:pStyle w:val="FirstParagraph"/>
@@ -54747,7 +54764,7 @@
         </m:oMath>
       </m:oMathPara>
     </w:p>
-    <w:bookmarkEnd w:id="184"/>
+    <w:bookmarkEnd w:id="185"/>
     <w:p>
       <w:pPr>
         <w:pStyle w:val="FirstParagraph"/>
@@ -54794,7 +54811,7 @@
         <w:t xml:space="preserve">.</w:t>
       </w:r>
     </w:p>
-    <w:bookmarkStart w:id="185" w:name="exr-miller-taylor-log-one-minus-x"/>
+    <w:bookmarkStart w:id="186" w:name="exr-miller-taylor-log-one-minus-x"/>
     <w:p>
       <w:pPr>
         <w:pStyle w:val="BodyText"/>
@@ -54979,8 +54996,8 @@
         <w:t xml:space="preserve">.</w:t>
       </w:r>
     </w:p>
-    <w:bookmarkEnd w:id="185"/>
-    <w:bookmarkStart w:id="186" w:name="sol-miller-taylor-log-one-minus-x"/>
+    <w:bookmarkEnd w:id="186"/>
+    <w:bookmarkStart w:id="187" w:name="sol-miller-taylor-log-one-minus-x"/>
     <w:p>
       <w:pPr>
         <w:pStyle w:val="BodyText"/>
@@ -55359,8 +55376,8 @@
         </m:oMath>
       </m:oMathPara>
     </w:p>
-    <w:bookmarkEnd w:id="186"/>
-    <w:bookmarkStart w:id="187" w:name="thm-taylor-log-one-minus-x"/>
+    <w:bookmarkEnd w:id="187"/>
+    <w:bookmarkStart w:id="188" w:name="thm-taylor-log-one-minus-x"/>
     <w:p>
       <w:pPr>
         <w:pStyle w:val="FirstParagraph"/>
@@ -55615,7 +55632,7 @@
         </m:oMath>
       </m:oMathPara>
     </w:p>
-    <w:bookmarkEnd w:id="187"/>
+    <w:bookmarkEnd w:id="188"/>
     <w:p>
       <w:pPr>
         <w:pStyle w:val="FirstParagraph"/>
@@ -55662,7 +55679,7 @@
         <w:t xml:space="preserve">.</w:t>
       </w:r>
     </w:p>
-    <w:bookmarkStart w:id="188" w:name="exr-miller-taylor-log-product-exp"/>
+    <w:bookmarkStart w:id="189" w:name="exr-miller-taylor-log-product-exp"/>
     <w:p>
       <w:pPr>
         <w:pStyle w:val="BodyText"/>
@@ -55895,8 +55912,8 @@
         <w:t xml:space="preserve">.</w:t>
       </w:r>
     </w:p>
-    <w:bookmarkEnd w:id="188"/>
-    <w:bookmarkStart w:id="189" w:name="sol-miller-taylor-log-product-exp"/>
+    <w:bookmarkEnd w:id="189"/>
+    <w:bookmarkStart w:id="190" w:name="sol-miller-taylor-log-product-exp"/>
     <w:p>
       <w:pPr>
         <w:pStyle w:val="BodyText"/>
@@ -56528,8 +56545,8 @@
         </m:oMath>
       </m:oMathPara>
     </w:p>
-    <w:bookmarkEnd w:id="189"/>
-    <w:bookmarkStart w:id="190" w:name="exr-miller-taylor-product-cos-log"/>
+    <w:bookmarkEnd w:id="190"/>
+    <w:bookmarkStart w:id="191" w:name="exr-miller-taylor-product-cos-log"/>
     <w:p>
       <w:pPr>
         <w:pStyle w:val="FirstParagraph"/>
@@ -56689,8 +56706,8 @@
         <w:t xml:space="preserve">.</w:t>
       </w:r>
     </w:p>
-    <w:bookmarkEnd w:id="190"/>
-    <w:bookmarkStart w:id="191" w:name="sol-miller-taylor-product-cos-log"/>
+    <w:bookmarkEnd w:id="191"/>
+    <w:bookmarkStart w:id="192" w:name="sol-miller-taylor-product-cos-log"/>
     <w:p>
       <w:pPr>
         <w:pStyle w:val="BodyText"/>
@@ -57189,8 +57206,8 @@
         </m:oMath>
       </m:oMathPara>
     </w:p>
-    <w:bookmarkEnd w:id="191"/>
-    <w:bookmarkStart w:id="192" w:name="exr-miller-taylor-log-scaled"/>
+    <w:bookmarkEnd w:id="192"/>
+    <w:bookmarkStart w:id="193" w:name="exr-miller-taylor-log-scaled"/>
     <w:p>
       <w:pPr>
         <w:pStyle w:val="FirstParagraph"/>
@@ -57381,8 +57398,8 @@
         <w:t xml:space="preserve">.</w:t>
       </w:r>
     </w:p>
-    <w:bookmarkEnd w:id="192"/>
-    <w:bookmarkStart w:id="193" w:name="sol-miller-taylor-log-scaled"/>
+    <w:bookmarkEnd w:id="193"/>
+    <w:bookmarkStart w:id="194" w:name="sol-miller-taylor-log-scaled"/>
     <w:p>
       <w:pPr>
         <w:pStyle w:val="BodyText"/>
@@ -57699,9 +57716,9 @@
         </m:oMath>
       </m:oMathPara>
     </w:p>
-    <w:bookmarkEnd w:id="193"/>
-    <w:bookmarkStart w:id="200" w:name="refs"/>
-    <w:bookmarkStart w:id="195" w:name="ref-boyd2018vmls"/>
+    <w:bookmarkEnd w:id="194"/>
+    <w:bookmarkStart w:id="201" w:name="refs"/>
+    <w:bookmarkStart w:id="196" w:name="ref-boyd2018vmls"/>
     <w:p>
       <w:pPr>
         <w:pStyle w:val="Bibliography"/>
@@ -57725,7 +57742,7 @@
       <w:r>
         <w:t xml:space="preserve"> </w:t>
       </w:r>
-      <w:hyperlink r:id="rId194">
+      <w:hyperlink r:id="rId195">
         <w:r>
           <w:rPr>
             <w:rStyle w:val="Hyperlink"/>
@@ -57737,8 +57754,8 @@
         <w:t xml:space="preserve">.</w:t>
       </w:r>
     </w:p>
-    <w:bookmarkEnd w:id="195"/>
-    <w:bookmarkStart w:id="197" w:name="ref-larsonCalc11e"/>
+    <w:bookmarkEnd w:id="196"/>
+    <w:bookmarkStart w:id="198" w:name="ref-larsonCalc11e"/>
     <w:p>
       <w:pPr>
         <w:pStyle w:val="Bibliography"/>
@@ -57762,7 +57779,7 @@
       <w:r>
         <w:t xml:space="preserve"> </w:t>
       </w:r>
-      <w:hyperlink r:id="rId196">
+      <w:hyperlink r:id="rId197">
         <w:r>
           <w:rPr>
             <w:rStyle w:val="Hyperlink"/>
@@ -57774,8 +57791,8 @@
         <w:t xml:space="preserve">.</w:t>
       </w:r>
     </w:p>
-    <w:bookmarkEnd w:id="197"/>
-    <w:bookmarkStart w:id="199" w:name="ref-problifesavercalc"/>
+    <w:bookmarkEnd w:id="198"/>
+    <w:bookmarkStart w:id="200" w:name="ref-problifesavercalc"/>
     <w:p>
       <w:pPr>
         <w:pStyle w:val="Bibliography"/>
@@ -57799,7 +57816,7 @@
       <w:r>
         <w:t xml:space="preserve"> </w:t>
       </w:r>
-      <w:hyperlink r:id="rId198">
+      <w:hyperlink r:id="rId199">
         <w:r>
           <w:rPr>
             <w:rStyle w:val="Hyperlink"/>
@@ -57811,10 +57828,10 @@
         <w:t xml:space="preserve">.</w:t>
       </w:r>
     </w:p>
-    <w:bookmarkEnd w:id="199"/>
     <w:bookmarkEnd w:id="200"/>
     <w:bookmarkEnd w:id="201"/>
     <w:bookmarkEnd w:id="202"/>
+    <w:bookmarkEnd w:id="203"/>
     <w:sectPr>
       <w:footnotePr>
         <w:numRestart w:val="eachSect"/>

</xml_diff>

<commit_message>
Deploying to gh-pages from @ Morrison-Lab/mds@3297a382d924f8d3b3aaaaf3dc39101e7ccd85e5 🚀
</commit_message>
<xml_diff>
--- a/calculus-derivatives.docx
+++ b/calculus-derivatives.docx
@@ -15,10 +15,10 @@
         <w:pStyle w:val="Date"/>
       </w:pPr>
       <w:r>
-        <w:t xml:space="preserve">Last modified: 2026-10-27 00:23:12 (PDT)</w:t>
+        <w:t xml:space="preserve">Last modified: 2026-10-27 01:34:30 (PDT)</w:t>
       </w:r>
     </w:p>
-    <w:bookmarkStart w:id="229" w:name="sec-derivatives"/>
+    <w:bookmarkStart w:id="232" w:name="sec-derivatives"/>
     <w:p>
       <w:pPr>
         <w:pStyle w:val="Heading2"/>
@@ -34493,7 +34493,7 @@
     </w:p>
     <w:bookmarkEnd w:id="133"/>
     <w:bookmarkEnd w:id="134"/>
-    <w:bookmarkStart w:id="150" w:name="sec-critical-points"/>
+    <w:bookmarkStart w:id="153" w:name="sec-critical-points"/>
     <w:p>
       <w:pPr>
         <w:pStyle w:val="Heading3"/>
@@ -37635,7 +37635,7 @@
       </w:r>
     </w:p>
     <w:bookmarkEnd w:id="143"/>
-    <w:bookmarkStart w:id="144" w:name="thm-flat-point-critical"/>
+    <w:bookmarkStart w:id="146" w:name="thm-flat-point-critical"/>
     <w:p>
       <w:pPr>
         <w:pStyle w:val="FirstParagraph"/>
@@ -37681,12 +37681,12 @@
       <w:r>
         <w:t xml:space="preserve">(</w:t>
       </w:r>
-      <w:hyperlink w:anchor="def-flat-point">
+      <w:hyperlink r:id="rId144">
         <w:r>
           <w:rPr>
             <w:rStyle w:val="Hyperlink"/>
           </w:rPr>
-          <w:t xml:space="preserve">Definition 18</w:t>
+          <w:t xml:space="preserve">Definition 1 in Optimization</w:t>
         </w:r>
       </w:hyperlink>
       <w:r>
@@ -37720,19 +37720,19 @@
       <w:r>
         <w:t xml:space="preserve">(</w:t>
       </w:r>
-      <w:hyperlink w:anchor="def-critical-point">
+      <w:hyperlink r:id="rId145">
         <w:r>
           <w:rPr>
             <w:rStyle w:val="Hyperlink"/>
           </w:rPr>
-          <w:t xml:space="preserve">Definition 19</w:t>
+          <w:t xml:space="preserve">Definition 2 in Optimization</w:t>
         </w:r>
       </w:hyperlink>
       <w:r>
         <w:t xml:space="preserve">).</w:t>
       </w:r>
     </w:p>
-    <w:bookmarkEnd w:id="144"/>
+    <w:bookmarkEnd w:id="146"/>
     <w:p>
       <w:pPr>
         <w:pStyle w:val="BodyText"/>
@@ -37904,12 +37904,12 @@
       <w:r>
         <w:t xml:space="preserve"> </w:t>
       </w:r>
-      <w:hyperlink w:anchor="def-critical-point">
+      <w:hyperlink r:id="rId145">
         <w:r>
           <w:rPr>
             <w:rStyle w:val="Hyperlink"/>
           </w:rPr>
-          <w:t xml:space="preserve">Definition 19</w:t>
+          <w:t xml:space="preserve">Definition 2 in Optimization</w:t>
         </w:r>
       </w:hyperlink>
       <w:r>
@@ -37936,7 +37936,7 @@
         <w:t xml:space="preserve">is a critical point.</w:t>
       </w:r>
     </w:p>
-    <w:bookmarkStart w:id="145" w:name="exm-flat-point-critical"/>
+    <w:bookmarkStart w:id="148" w:name="exm-flat-point-critical"/>
     <w:p>
       <w:pPr>
         <w:pStyle w:val="BodyText"/>
@@ -38897,12 +38897,12 @@
       <w:r>
         <w:t xml:space="preserve"> </w:t>
       </w:r>
-      <w:hyperlink w:anchor="thm-flat-point-critical">
+      <w:hyperlink r:id="rId147">
         <w:r>
           <w:rPr>
             <w:rStyle w:val="Hyperlink"/>
           </w:rPr>
-          <w:t xml:space="preserve">Theorem 13</w:t>
+          <w:t xml:space="preserve">Theorem 1 in Optimization</w:t>
         </w:r>
       </w:hyperlink>
       <w:r>
@@ -39010,20 +39010,20 @@
       <w:r>
         <w:t xml:space="preserve">(</w:t>
       </w:r>
-      <w:hyperlink w:anchor="def-critical-point">
+      <w:hyperlink r:id="rId145">
         <w:r>
           <w:rPr>
             <w:rStyle w:val="Hyperlink"/>
           </w:rPr>
-          <w:t xml:space="preserve">Definition 19</w:t>
+          <w:t xml:space="preserve">Definition 2 in Optimization</w:t>
         </w:r>
       </w:hyperlink>
       <w:r>
         <w:t xml:space="preserve">), but not a flat point.</w:t>
       </w:r>
     </w:p>
-    <w:bookmarkEnd w:id="145"/>
-    <w:bookmarkStart w:id="146" w:name="exr-miller-deriv-opt-gamma-kernel"/>
+    <w:bookmarkEnd w:id="148"/>
+    <w:bookmarkStart w:id="149" w:name="exr-miller-deriv-opt-gamma-kernel"/>
     <w:p>
       <w:pPr>
         <w:pStyle w:val="BodyText"/>
@@ -39168,8 +39168,8 @@
         <w:t xml:space="preserve">.</w:t>
       </w:r>
     </w:p>
-    <w:bookmarkEnd w:id="146"/>
-    <w:bookmarkStart w:id="147" w:name="sol-miller-deriv-opt-gamma-kernel"/>
+    <w:bookmarkEnd w:id="149"/>
+    <w:bookmarkStart w:id="150" w:name="sol-miller-deriv-opt-gamma-kernel"/>
     <w:p>
       <w:pPr>
         <w:pStyle w:val="BodyText"/>
@@ -40053,8 +40053,8 @@
         <w:t xml:space="preserve">.</w:t>
       </w:r>
     </w:p>
-    <w:bookmarkEnd w:id="147"/>
-    <w:bookmarkStart w:id="148" w:name="X2af8583915c3d6755df2ace9fe2e1b48908f679"/>
+    <w:bookmarkEnd w:id="150"/>
+    <w:bookmarkStart w:id="151" w:name="X2af8583915c3d6755df2ace9fe2e1b48908f679"/>
     <w:p>
       <w:pPr>
         <w:pStyle w:val="BodyText"/>
@@ -40170,8 +40170,8 @@
         <w:t xml:space="preserve">and decide whether each is a local maximum, a local minimum, or an inflection point.</w:t>
       </w:r>
     </w:p>
-    <w:bookmarkEnd w:id="148"/>
-    <w:bookmarkStart w:id="149" w:name="X9a58de6c6ab4baf2df3e3111c406b3abe7c25e0"/>
+    <w:bookmarkEnd w:id="151"/>
+    <w:bookmarkStart w:id="152" w:name="X9a58de6c6ab4baf2df3e3111c406b3abe7c25e0"/>
     <w:p>
       <w:pPr>
         <w:pStyle w:val="BodyText"/>
@@ -40948,9 +40948,9 @@
         <w:t xml:space="preserve">is non-zero at both critical points, neither is an inflection point.</w:t>
       </w:r>
     </w:p>
-    <w:bookmarkEnd w:id="149"/>
-    <w:bookmarkEnd w:id="150"/>
-    <w:bookmarkStart w:id="228" w:name="sec-taylor-series"/>
+    <w:bookmarkEnd w:id="152"/>
+    <w:bookmarkEnd w:id="153"/>
+    <w:bookmarkStart w:id="231" w:name="sec-taylor-series"/>
     <w:p>
       <w:pPr>
         <w:pStyle w:val="Heading3"/>
@@ -40959,7 +40959,7 @@
         <w:t xml:space="preserve">1.7 Taylor series</w:t>
       </w:r>
     </w:p>
-    <w:bookmarkStart w:id="152" w:name="def-taylor-polynomial"/>
+    <w:bookmarkStart w:id="155" w:name="def-taylor-polynomial"/>
     <w:p>
       <w:pPr>
         <w:pStyle w:val="FirstParagraph"/>
@@ -41103,7 +41103,7 @@
       <w:pPr>
         <w:pStyle w:val="BodyText"/>
       </w:pPr>
-      <w:bookmarkStart w:id="151" w:name="eq-taylor-poly-def"/>
+      <w:bookmarkStart w:id="154" w:name="eq-taylor-poly-def"/>
       <m:oMathPara>
         <m:oMathParaPr>
           <m:jc m:val="center"/>
@@ -41653,10 +41653,10 @@
           </m:r>
         </m:oMath>
       </m:oMathPara>
-      <w:bookmarkEnd w:id="151"/>
+      <w:bookmarkEnd w:id="154"/>
     </w:p>
-    <w:bookmarkEnd w:id="152"/>
-    <w:bookmarkStart w:id="153" w:name="exm-taylor-polynomial-exponential"/>
+    <w:bookmarkEnd w:id="155"/>
+    <w:bookmarkStart w:id="156" w:name="exm-taylor-polynomial-exponential"/>
     <w:p>
       <w:pPr>
         <w:pStyle w:val="FirstParagraph"/>
@@ -42301,8 +42301,8 @@
         </m:oMath>
       </m:oMathPara>
     </w:p>
-    <w:bookmarkEnd w:id="153"/>
-    <w:bookmarkStart w:id="154" w:name="def-maclaurin-polynomial"/>
+    <w:bookmarkEnd w:id="156"/>
+    <w:bookmarkStart w:id="157" w:name="def-maclaurin-polynomial"/>
     <w:p>
       <w:pPr>
         <w:pStyle w:val="FirstParagraph"/>
@@ -42412,8 +42412,8 @@
         <w:t xml:space="preserve">.</w:t>
       </w:r>
     </w:p>
-    <w:bookmarkEnd w:id="154"/>
-    <w:bookmarkStart w:id="155" w:name="def-taylor-series"/>
+    <w:bookmarkEnd w:id="157"/>
+    <w:bookmarkStart w:id="158" w:name="def-taylor-series"/>
     <w:p>
       <w:pPr>
         <w:pStyle w:val="BodyText"/>
@@ -42753,7 +42753,7 @@
         <w:t xml:space="preserve">.</w:t>
       </w:r>
     </w:p>
-    <w:bookmarkEnd w:id="155"/>
+    <w:bookmarkEnd w:id="158"/>
     <w:tbl>
       <w:tblPr>
         <w:tblStyle w:val="Table"/>
@@ -42795,12 +42795,12 @@
                 <wp:inline>
                   <wp:extent cx="152400" cy="152400"/>
                   <wp:effectExtent b="0" l="0" r="0" t="0"/>
-                  <wp:docPr descr="" title="" id="156" name="Picture"/>
+                  <wp:docPr descr="" title="" id="159" name="Picture"/>
                   <a:graphic>
                     <a:graphicData uri="http://schemas.openxmlformats.org/drawingml/2006/picture">
                       <pic:pic>
                         <pic:nvPicPr>
-                          <pic:cNvPr descr="/opt/quarto/share/formats/docx/tip.png" id="157" name="Picture"/>
+                          <pic:cNvPr descr="/opt/quarto/share/formats/docx/tip.png" id="160" name="Picture"/>
                           <pic:cNvPicPr>
                             <a:picLocks noChangeArrowheads="1" noChangeAspect="1"/>
                           </pic:cNvPicPr>
@@ -42868,7 +42868,7 @@
             <w:r>
               <w:t xml:space="preserve"> </w:t>
             </w:r>
-            <w:hyperlink r:id="rId158">
+            <w:hyperlink r:id="rId161">
               <w:r>
                 <w:rPr>
                   <w:rStyle w:val="Hyperlink"/>
@@ -42899,7 +42899,7 @@
                 <w:numId w:val="1020"/>
               </w:numPr>
             </w:pPr>
-            <w:hyperlink r:id="rId159">
+            <w:hyperlink r:id="rId162">
               <w:r>
                 <w:rPr>
                   <w:rStyle w:val="Hyperlink"/>
@@ -42929,7 +42929,7 @@
         </w:tc>
       </w:tr>
     </w:tbl>
-    <w:bookmarkStart w:id="160" w:name="exr-miller-taylor-poly-zero"/>
+    <w:bookmarkStart w:id="163" w:name="exr-miller-taylor-poly-zero"/>
     <w:p>
       <w:pPr>
         <w:pStyle w:val="FirstParagraph"/>
@@ -43077,8 +43077,8 @@
         <w:t xml:space="preserve">.</w:t>
       </w:r>
     </w:p>
-    <w:bookmarkEnd w:id="160"/>
-    <w:bookmarkStart w:id="161" w:name="sol-miller-taylor-poly-zero"/>
+    <w:bookmarkEnd w:id="163"/>
+    <w:bookmarkStart w:id="164" w:name="sol-miller-taylor-poly-zero"/>
     <w:p>
       <w:pPr>
         <w:pStyle w:val="BodyText"/>
@@ -44032,8 +44032,8 @@
         <w:t xml:space="preserve">, its Taylor polynomial of degree 4 simply collects its terms of degree at most 4.</w:t>
       </w:r>
     </w:p>
-    <w:bookmarkEnd w:id="161"/>
-    <w:bookmarkStart w:id="162" w:name="exr-miller-taylor-poly-nonzero"/>
+    <w:bookmarkEnd w:id="164"/>
+    <w:bookmarkStart w:id="165" w:name="exr-miller-taylor-poly-nonzero"/>
     <w:p>
       <w:pPr>
         <w:pStyle w:val="BodyText"/>
@@ -44181,8 +44181,8 @@
         <w:t xml:space="preserve">.</w:t>
       </w:r>
     </w:p>
-    <w:bookmarkEnd w:id="162"/>
-    <w:bookmarkStart w:id="163" w:name="sol-miller-taylor-poly-nonzero"/>
+    <w:bookmarkEnd w:id="165"/>
+    <w:bookmarkStart w:id="166" w:name="sol-miller-taylor-poly-nonzero"/>
     <w:p>
       <w:pPr>
         <w:pStyle w:val="BodyText"/>
@@ -44884,8 +44884,8 @@
         </m:oMath>
       </m:oMathPara>
     </w:p>
-    <w:bookmarkEnd w:id="163"/>
-    <w:bookmarkStart w:id="164" w:name="exm-taylor-polynomial-cosine"/>
+    <w:bookmarkEnd w:id="166"/>
+    <w:bookmarkStart w:id="167" w:name="exm-taylor-polynomial-cosine"/>
     <w:p>
       <w:pPr>
         <w:pStyle w:val="FirstParagraph"/>
@@ -45814,8 +45814,8 @@
         </m:oMath>
       </m:oMathPara>
     </w:p>
-    <w:bookmarkEnd w:id="164"/>
-    <w:bookmarkStart w:id="165" w:name="exm-taylor-polynomial-sine"/>
+    <w:bookmarkEnd w:id="167"/>
+    <w:bookmarkStart w:id="168" w:name="exm-taylor-polynomial-sine"/>
     <w:p>
       <w:pPr>
         <w:pStyle w:val="FirstParagraph"/>
@@ -46420,8 +46420,8 @@
         </m:oMath>
       </m:oMathPara>
     </w:p>
-    <w:bookmarkEnd w:id="165"/>
-    <w:bookmarkStart w:id="166" w:name="exr-miller-taylor-cos-scaled"/>
+    <w:bookmarkEnd w:id="168"/>
+    <w:bookmarkStart w:id="169" w:name="exr-miller-taylor-cos-scaled"/>
     <w:p>
       <w:pPr>
         <w:pStyle w:val="FirstParagraph"/>
@@ -46554,8 +46554,8 @@
         <w:t xml:space="preserve">.</w:t>
       </w:r>
     </w:p>
-    <w:bookmarkEnd w:id="166"/>
-    <w:bookmarkStart w:id="167" w:name="sol-miller-taylor-cos-scaled"/>
+    <w:bookmarkEnd w:id="169"/>
+    <w:bookmarkStart w:id="170" w:name="sol-miller-taylor-cos-scaled"/>
     <w:p>
       <w:pPr>
         <w:pStyle w:val="BodyText"/>
@@ -46995,8 +46995,8 @@
         <w:t xml:space="preserve">Substituting into known Taylor expansions avoids computing high-order derivatives by hand.</w:t>
       </w:r>
     </w:p>
-    <w:bookmarkEnd w:id="167"/>
-    <w:bookmarkStart w:id="168" w:name="exr-miller-taylor-cos-cubed"/>
+    <w:bookmarkEnd w:id="170"/>
+    <w:bookmarkStart w:id="171" w:name="exr-miller-taylor-cos-cubed"/>
     <w:p>
       <w:pPr>
         <w:pStyle w:val="BodyText"/>
@@ -47138,8 +47138,8 @@
         <w:t xml:space="preserve">.</w:t>
       </w:r>
     </w:p>
-    <w:bookmarkEnd w:id="168"/>
-    <w:bookmarkStart w:id="169" w:name="sol-miller-taylor-cos-cubed"/>
+    <w:bookmarkEnd w:id="171"/>
+    <w:bookmarkStart w:id="172" w:name="sol-miller-taylor-cos-cubed"/>
     <w:p>
       <w:pPr>
         <w:pStyle w:val="BodyText"/>
@@ -48062,8 +48062,8 @@
         </m:oMath>
       </m:oMathPara>
     </w:p>
-    <w:bookmarkEnd w:id="169"/>
-    <w:bookmarkStart w:id="170" w:name="exr-miller-taylor-exp-base"/>
+    <w:bookmarkEnd w:id="172"/>
+    <w:bookmarkStart w:id="173" w:name="exr-miller-taylor-exp-base"/>
     <w:p>
       <w:pPr>
         <w:pStyle w:val="FirstParagraph"/>
@@ -48184,8 +48184,8 @@
         <w:t xml:space="preserve">.</w:t>
       </w:r>
     </w:p>
-    <w:bookmarkEnd w:id="170"/>
-    <w:bookmarkStart w:id="171" w:name="sol-miller-taylor-exp-base"/>
+    <w:bookmarkEnd w:id="173"/>
+    <w:bookmarkStart w:id="174" w:name="sol-miller-taylor-exp-base"/>
     <w:p>
       <w:pPr>
         <w:pStyle w:val="BodyText"/>
@@ -48708,8 +48708,8 @@
         </m:oMath>
       </m:oMathPara>
     </w:p>
-    <w:bookmarkEnd w:id="171"/>
-    <w:bookmarkStart w:id="172" w:name="exr-miller-taylor-exp-power"/>
+    <w:bookmarkEnd w:id="174"/>
+    <w:bookmarkStart w:id="175" w:name="exr-miller-taylor-exp-power"/>
     <w:p>
       <w:pPr>
         <w:pStyle w:val="FirstParagraph"/>
@@ -48852,8 +48852,8 @@
         <w:t xml:space="preserve">.</w:t>
       </w:r>
     </w:p>
-    <w:bookmarkEnd w:id="172"/>
-    <w:bookmarkStart w:id="173" w:name="sol-miller-taylor-exp-power"/>
+    <w:bookmarkEnd w:id="175"/>
+    <w:bookmarkStart w:id="176" w:name="sol-miller-taylor-exp-power"/>
     <w:p>
       <w:pPr>
         <w:pStyle w:val="BodyText"/>
@@ -49393,8 +49393,8 @@
         </m:oMath>
       </m:oMathPara>
     </w:p>
-    <w:bookmarkEnd w:id="173"/>
-    <w:bookmarkStart w:id="174" w:name="exr-miller-taylor-normal-density"/>
+    <w:bookmarkEnd w:id="176"/>
+    <w:bookmarkStart w:id="177" w:name="exr-miller-taylor-normal-density"/>
     <w:p>
       <w:pPr>
         <w:pStyle w:val="FirstParagraph"/>
@@ -49581,8 +49581,8 @@
         <w:t xml:space="preserve">.</w:t>
       </w:r>
     </w:p>
-    <w:bookmarkEnd w:id="174"/>
-    <w:bookmarkStart w:id="175" w:name="sol-miller-taylor-normal-density"/>
+    <w:bookmarkEnd w:id="177"/>
+    <w:bookmarkStart w:id="178" w:name="sol-miller-taylor-normal-density"/>
     <w:p>
       <w:pPr>
         <w:pStyle w:val="BodyText"/>
@@ -50156,8 +50156,8 @@
         </m:oMath>
       </m:oMathPara>
     </w:p>
-    <w:bookmarkEnd w:id="175"/>
-    <w:bookmarkStart w:id="176" w:name="thm-taylor-normal-density"/>
+    <w:bookmarkEnd w:id="178"/>
+    <w:bookmarkStart w:id="179" w:name="thm-taylor-normal-density"/>
     <w:p>
       <w:pPr>
         <w:pStyle w:val="FirstParagraph"/>
@@ -50415,7 +50415,7 @@
         </m:oMath>
       </m:oMathPara>
     </w:p>
-    <w:bookmarkEnd w:id="176"/>
+    <w:bookmarkEnd w:id="179"/>
     <w:p>
       <w:pPr>
         <w:pStyle w:val="FirstParagraph"/>
@@ -50462,7 +50462,7 @@
         <w:t xml:space="preserve">.</w:t>
       </w:r>
     </w:p>
-    <w:bookmarkStart w:id="177" w:name="exr-miller-taylor-sqrt"/>
+    <w:bookmarkStart w:id="180" w:name="exr-miller-taylor-sqrt"/>
     <w:p>
       <w:pPr>
         <w:pStyle w:val="BodyText"/>
@@ -50591,8 +50591,8 @@
         <w:t xml:space="preserve">.</w:t>
       </w:r>
     </w:p>
-    <w:bookmarkEnd w:id="177"/>
-    <w:bookmarkStart w:id="178" w:name="sol-miller-taylor-sqrt"/>
+    <w:bookmarkEnd w:id="180"/>
+    <w:bookmarkStart w:id="181" w:name="sol-miller-taylor-sqrt"/>
     <w:p>
       <w:pPr>
         <w:pStyle w:val="BodyText"/>
@@ -51472,8 +51472,8 @@
         </m:oMath>
       </m:oMathPara>
     </w:p>
-    <w:bookmarkEnd w:id="178"/>
-    <w:bookmarkStart w:id="179" w:name="exr-miller-taylor-cube-root"/>
+    <w:bookmarkEnd w:id="181"/>
+    <w:bookmarkStart w:id="182" w:name="exr-miller-taylor-cube-root"/>
     <w:p>
       <w:pPr>
         <w:pStyle w:val="FirstParagraph"/>
@@ -51633,8 +51633,8 @@
         <w:t xml:space="preserve">.</w:t>
       </w:r>
     </w:p>
-    <w:bookmarkEnd w:id="179"/>
-    <w:bookmarkStart w:id="180" w:name="sol-miller-taylor-cube-root"/>
+    <w:bookmarkEnd w:id="182"/>
+    <w:bookmarkStart w:id="183" w:name="sol-miller-taylor-cube-root"/>
     <w:p>
       <w:pPr>
         <w:pStyle w:val="BodyText"/>
@@ -52946,8 +52946,8 @@
         </m:oMath>
       </m:oMathPara>
     </w:p>
-    <w:bookmarkEnd w:id="180"/>
-    <w:bookmarkStart w:id="181" w:name="exr-miller-taylor-x-log-x"/>
+    <w:bookmarkEnd w:id="183"/>
+    <w:bookmarkStart w:id="184" w:name="exr-miller-taylor-x-log-x"/>
     <w:p>
       <w:pPr>
         <w:pStyle w:val="FirstParagraph"/>
@@ -53096,8 +53096,8 @@
         <w:t xml:space="preserve">.</w:t>
       </w:r>
     </w:p>
-    <w:bookmarkEnd w:id="181"/>
-    <w:bookmarkStart w:id="182" w:name="sol-miller-taylor-x-log-x"/>
+    <w:bookmarkEnd w:id="184"/>
+    <w:bookmarkStart w:id="185" w:name="sol-miller-taylor-x-log-x"/>
     <w:p>
       <w:pPr>
         <w:pStyle w:val="BodyText"/>
@@ -53761,8 +53761,8 @@
         </m:oMath>
       </m:oMathPara>
     </w:p>
-    <w:bookmarkEnd w:id="182"/>
-    <w:bookmarkStart w:id="183" w:name="exr-miller-taylor-log-one-plus-x"/>
+    <w:bookmarkEnd w:id="185"/>
+    <w:bookmarkStart w:id="186" w:name="exr-miller-taylor-log-one-plus-x"/>
     <w:p>
       <w:pPr>
         <w:pStyle w:val="FirstParagraph"/>
@@ -53947,8 +53947,8 @@
         <w:t xml:space="preserve">.</w:t>
       </w:r>
     </w:p>
-    <w:bookmarkEnd w:id="183"/>
-    <w:bookmarkStart w:id="184" w:name="sol-miller-taylor-log-one-plus-x"/>
+    <w:bookmarkEnd w:id="186"/>
+    <w:bookmarkStart w:id="187" w:name="sol-miller-taylor-log-one-plus-x"/>
     <w:p>
       <w:pPr>
         <w:pStyle w:val="BodyText"/>
@@ -54568,8 +54568,8 @@
         </m:oMath>
       </m:oMathPara>
     </w:p>
-    <w:bookmarkEnd w:id="184"/>
-    <w:bookmarkStart w:id="185" w:name="thm-taylor-log-one-plus-x"/>
+    <w:bookmarkEnd w:id="187"/>
+    <w:bookmarkStart w:id="188" w:name="thm-taylor-log-one-plus-x"/>
     <w:p>
       <w:pPr>
         <w:pStyle w:val="FirstParagraph"/>
@@ -54818,7 +54818,7 @@
         </m:oMath>
       </m:oMathPara>
     </w:p>
-    <w:bookmarkEnd w:id="185"/>
+    <w:bookmarkEnd w:id="188"/>
     <w:p>
       <w:pPr>
         <w:pStyle w:val="FirstParagraph"/>
@@ -54865,7 +54865,7 @@
         <w:t xml:space="preserve">.</w:t>
       </w:r>
     </w:p>
-    <w:bookmarkStart w:id="186" w:name="exr-miller-taylor-log-one-minus-x"/>
+    <w:bookmarkStart w:id="189" w:name="exr-miller-taylor-log-one-minus-x"/>
     <w:p>
       <w:pPr>
         <w:pStyle w:val="BodyText"/>
@@ -55050,8 +55050,8 @@
         <w:t xml:space="preserve">.</w:t>
       </w:r>
     </w:p>
-    <w:bookmarkEnd w:id="186"/>
-    <w:bookmarkStart w:id="187" w:name="sol-miller-taylor-log-one-minus-x"/>
+    <w:bookmarkEnd w:id="189"/>
+    <w:bookmarkStart w:id="190" w:name="sol-miller-taylor-log-one-minus-x"/>
     <w:p>
       <w:pPr>
         <w:pStyle w:val="BodyText"/>
@@ -55430,8 +55430,8 @@
         </m:oMath>
       </m:oMathPara>
     </w:p>
-    <w:bookmarkEnd w:id="187"/>
-    <w:bookmarkStart w:id="188" w:name="thm-taylor-log-one-minus-x"/>
+    <w:bookmarkEnd w:id="190"/>
+    <w:bookmarkStart w:id="191" w:name="thm-taylor-log-one-minus-x"/>
     <w:p>
       <w:pPr>
         <w:pStyle w:val="FirstParagraph"/>
@@ -55686,7 +55686,7 @@
         </m:oMath>
       </m:oMathPara>
     </w:p>
-    <w:bookmarkEnd w:id="188"/>
+    <w:bookmarkEnd w:id="191"/>
     <w:p>
       <w:pPr>
         <w:pStyle w:val="FirstParagraph"/>
@@ -55733,7 +55733,7 @@
         <w:t xml:space="preserve">.</w:t>
       </w:r>
     </w:p>
-    <w:bookmarkStart w:id="189" w:name="exr-miller-taylor-log-product-exp"/>
+    <w:bookmarkStart w:id="192" w:name="exr-miller-taylor-log-product-exp"/>
     <w:p>
       <w:pPr>
         <w:pStyle w:val="BodyText"/>
@@ -55966,8 +55966,8 @@
         <w:t xml:space="preserve">.</w:t>
       </w:r>
     </w:p>
-    <w:bookmarkEnd w:id="189"/>
-    <w:bookmarkStart w:id="190" w:name="sol-miller-taylor-log-product-exp"/>
+    <w:bookmarkEnd w:id="192"/>
+    <w:bookmarkStart w:id="193" w:name="sol-miller-taylor-log-product-exp"/>
     <w:p>
       <w:pPr>
         <w:pStyle w:val="BodyText"/>
@@ -56599,8 +56599,8 @@
         </m:oMath>
       </m:oMathPara>
     </w:p>
-    <w:bookmarkEnd w:id="190"/>
-    <w:bookmarkStart w:id="191" w:name="exr-miller-taylor-product-cos-log"/>
+    <w:bookmarkEnd w:id="193"/>
+    <w:bookmarkStart w:id="194" w:name="exr-miller-taylor-product-cos-log"/>
     <w:p>
       <w:pPr>
         <w:pStyle w:val="FirstParagraph"/>
@@ -56760,8 +56760,8 @@
         <w:t xml:space="preserve">.</w:t>
       </w:r>
     </w:p>
-    <w:bookmarkEnd w:id="191"/>
-    <w:bookmarkStart w:id="192" w:name="sol-miller-taylor-product-cos-log"/>
+    <w:bookmarkEnd w:id="194"/>
+    <w:bookmarkStart w:id="195" w:name="sol-miller-taylor-product-cos-log"/>
     <w:p>
       <w:pPr>
         <w:pStyle w:val="BodyText"/>
@@ -57260,8 +57260,8 @@
         </m:oMath>
       </m:oMathPara>
     </w:p>
-    <w:bookmarkEnd w:id="192"/>
-    <w:bookmarkStart w:id="193" w:name="exr-miller-taylor-log-scaled"/>
+    <w:bookmarkEnd w:id="195"/>
+    <w:bookmarkStart w:id="196" w:name="exr-miller-taylor-log-scaled"/>
     <w:p>
       <w:pPr>
         <w:pStyle w:val="FirstParagraph"/>
@@ -57452,8 +57452,8 @@
         <w:t xml:space="preserve">.</w:t>
       </w:r>
     </w:p>
-    <w:bookmarkEnd w:id="193"/>
-    <w:bookmarkStart w:id="194" w:name="sol-miller-taylor-log-scaled"/>
+    <w:bookmarkEnd w:id="196"/>
+    <w:bookmarkStart w:id="197" w:name="sol-miller-taylor-log-scaled"/>
     <w:p>
       <w:pPr>
         <w:pStyle w:val="BodyText"/>
@@ -57770,9 +57770,9 @@
         </m:oMath>
       </m:oMathPara>
     </w:p>
-    <w:bookmarkEnd w:id="194"/>
-    <w:bookmarkStart w:id="227" w:name="refs"/>
-    <w:bookmarkStart w:id="196" w:name="ref-wikipedia_limit_of_a_function"/>
+    <w:bookmarkEnd w:id="197"/>
+    <w:bookmarkStart w:id="230" w:name="refs"/>
+    <w:bookmarkStart w:id="199" w:name="ref-wikipedia_limit_of_a_function"/>
     <w:p>
       <w:pPr>
         <w:pStyle w:val="Bibliography"/>
@@ -57819,7 +57819,7 @@
       <w:r>
         <w:t xml:space="preserve"> </w:t>
       </w:r>
-      <w:hyperlink r:id="rId195">
+      <w:hyperlink r:id="rId198">
         <w:r>
           <w:rPr>
             <w:rStyle w:val="Hyperlink"/>
@@ -57828,8 +57828,8 @@
         </w:r>
       </w:hyperlink>
     </w:p>
-    <w:bookmarkEnd w:id="196"/>
-    <w:bookmarkStart w:id="198" w:name="ref-wikipedia_one_sided_limit"/>
+    <w:bookmarkEnd w:id="199"/>
+    <w:bookmarkStart w:id="201" w:name="ref-wikipedia_one_sided_limit"/>
     <w:p>
       <w:pPr>
         <w:pStyle w:val="Bibliography"/>
@@ -57876,7 +57876,7 @@
       <w:r>
         <w:t xml:space="preserve"> </w:t>
       </w:r>
-      <w:hyperlink r:id="rId197">
+      <w:hyperlink r:id="rId200">
         <w:r>
           <w:rPr>
             <w:rStyle w:val="Hyperlink"/>
@@ -57885,8 +57885,8 @@
         </w:r>
       </w:hyperlink>
     </w:p>
-    <w:bookmarkEnd w:id="198"/>
-    <w:bookmarkStart w:id="200" w:name="ref-wikipedia_difference_quotient"/>
+    <w:bookmarkEnd w:id="201"/>
+    <w:bookmarkStart w:id="203" w:name="ref-wikipedia_difference_quotient"/>
     <w:p>
       <w:pPr>
         <w:pStyle w:val="Bibliography"/>
@@ -57933,7 +57933,7 @@
       <w:r>
         <w:t xml:space="preserve"> </w:t>
       </w:r>
-      <w:hyperlink r:id="rId199">
+      <w:hyperlink r:id="rId202">
         <w:r>
           <w:rPr>
             <w:rStyle w:val="Hyperlink"/>
@@ -57942,8 +57942,8 @@
         </w:r>
       </w:hyperlink>
     </w:p>
-    <w:bookmarkEnd w:id="200"/>
-    <w:bookmarkStart w:id="202" w:name="ref-wikipedia_differentiable_function"/>
+    <w:bookmarkEnd w:id="203"/>
+    <w:bookmarkStart w:id="205" w:name="ref-wikipedia_differentiable_function"/>
     <w:p>
       <w:pPr>
         <w:pStyle w:val="Bibliography"/>
@@ -57990,7 +57990,7 @@
       <w:r>
         <w:t xml:space="preserve"> </w:t>
       </w:r>
-      <w:hyperlink r:id="rId201">
+      <w:hyperlink r:id="rId204">
         <w:r>
           <w:rPr>
             <w:rStyle w:val="Hyperlink"/>
@@ -57999,8 +57999,8 @@
         </w:r>
       </w:hyperlink>
     </w:p>
-    <w:bookmarkEnd w:id="202"/>
-    <w:bookmarkStart w:id="204" w:name="ref-larsonCalc11e"/>
+    <w:bookmarkEnd w:id="205"/>
+    <w:bookmarkStart w:id="207" w:name="ref-larsonCalc11e"/>
     <w:p>
       <w:pPr>
         <w:pStyle w:val="Bibliography"/>
@@ -58033,7 +58033,7 @@
       <w:r>
         <w:t xml:space="preserve"> </w:t>
       </w:r>
-      <w:hyperlink r:id="rId203">
+      <w:hyperlink r:id="rId206">
         <w:r>
           <w:rPr>
             <w:rStyle w:val="Hyperlink"/>
@@ -58042,8 +58042,8 @@
         </w:r>
       </w:hyperlink>
     </w:p>
-    <w:bookmarkEnd w:id="204"/>
-    <w:bookmarkStart w:id="206" w:name="ref-wikipedia_derivative"/>
+    <w:bookmarkEnd w:id="207"/>
+    <w:bookmarkStart w:id="209" w:name="ref-wikipedia_derivative"/>
     <w:p>
       <w:pPr>
         <w:pStyle w:val="Bibliography"/>
@@ -58090,7 +58090,7 @@
       <w:r>
         <w:t xml:space="preserve"> </w:t>
       </w:r>
-      <w:hyperlink r:id="rId205">
+      <w:hyperlink r:id="rId208">
         <w:r>
           <w:rPr>
             <w:rStyle w:val="Hyperlink"/>
@@ -58099,8 +58099,8 @@
         </w:r>
       </w:hyperlink>
     </w:p>
-    <w:bookmarkEnd w:id="206"/>
-    <w:bookmarkStart w:id="208" w:name="Xce9848c2f4a380db4acb3f03ebf9e8cf213ef4a"/>
+    <w:bookmarkEnd w:id="209"/>
+    <w:bookmarkStart w:id="211" w:name="Xce9848c2f4a380db4acb3f03ebf9e8cf213ef4a"/>
     <w:p>
       <w:pPr>
         <w:pStyle w:val="Bibliography"/>
@@ -58147,7 +58147,7 @@
       <w:r>
         <w:t xml:space="preserve"> </w:t>
       </w:r>
-      <w:hyperlink r:id="rId207">
+      <w:hyperlink r:id="rId210">
         <w:r>
           <w:rPr>
             <w:rStyle w:val="Hyperlink"/>
@@ -58156,8 +58156,8 @@
         </w:r>
       </w:hyperlink>
     </w:p>
-    <w:bookmarkEnd w:id="208"/>
-    <w:bookmarkStart w:id="210" w:name="ref-wikipedia_second_derivative"/>
+    <w:bookmarkEnd w:id="211"/>
+    <w:bookmarkStart w:id="213" w:name="ref-wikipedia_second_derivative"/>
     <w:p>
       <w:pPr>
         <w:pStyle w:val="Bibliography"/>
@@ -58204,7 +58204,7 @@
       <w:r>
         <w:t xml:space="preserve"> </w:t>
       </w:r>
-      <w:hyperlink r:id="rId209">
+      <w:hyperlink r:id="rId212">
         <w:r>
           <w:rPr>
             <w:rStyle w:val="Hyperlink"/>
@@ -58213,8 +58213,8 @@
         </w:r>
       </w:hyperlink>
     </w:p>
-    <w:bookmarkEnd w:id="210"/>
-    <w:bookmarkStart w:id="212" w:name="ref-wikipedia_power_rule"/>
+    <w:bookmarkEnd w:id="213"/>
+    <w:bookmarkStart w:id="215" w:name="ref-wikipedia_power_rule"/>
     <w:p>
       <w:pPr>
         <w:pStyle w:val="Bibliography"/>
@@ -58261,7 +58261,7 @@
       <w:r>
         <w:t xml:space="preserve"> </w:t>
       </w:r>
-      <w:hyperlink r:id="rId211">
+      <w:hyperlink r:id="rId214">
         <w:r>
           <w:rPr>
             <w:rStyle w:val="Hyperlink"/>
@@ -58270,8 +58270,8 @@
         </w:r>
       </w:hyperlink>
     </w:p>
-    <w:bookmarkEnd w:id="212"/>
-    <w:bookmarkStart w:id="214" w:name="ref-problifesavercalc"/>
+    <w:bookmarkEnd w:id="215"/>
+    <w:bookmarkStart w:id="217" w:name="ref-problifesavercalc"/>
     <w:p>
       <w:pPr>
         <w:pStyle w:val="Bibliography"/>
@@ -58304,7 +58304,7 @@
       <w:r>
         <w:t xml:space="preserve"> </w:t>
       </w:r>
-      <w:hyperlink r:id="rId213">
+      <w:hyperlink r:id="rId216">
         <w:r>
           <w:rPr>
             <w:rStyle w:val="Hyperlink"/>
@@ -58313,8 +58313,8 @@
         </w:r>
       </w:hyperlink>
     </w:p>
-    <w:bookmarkEnd w:id="214"/>
-    <w:bookmarkStart w:id="216" w:name="ref-wikipedia_product_rule"/>
+    <w:bookmarkEnd w:id="217"/>
+    <w:bookmarkStart w:id="219" w:name="ref-wikipedia_product_rule"/>
     <w:p>
       <w:pPr>
         <w:pStyle w:val="Bibliography"/>
@@ -58361,7 +58361,7 @@
       <w:r>
         <w:t xml:space="preserve"> </w:t>
       </w:r>
-      <w:hyperlink r:id="rId215">
+      <w:hyperlink r:id="rId218">
         <w:r>
           <w:rPr>
             <w:rStyle w:val="Hyperlink"/>
@@ -58370,8 +58370,8 @@
         </w:r>
       </w:hyperlink>
     </w:p>
-    <w:bookmarkEnd w:id="216"/>
-    <w:bookmarkStart w:id="218" w:name="ref-wikipedia_quotient_rule"/>
+    <w:bookmarkEnd w:id="219"/>
+    <w:bookmarkStart w:id="221" w:name="ref-wikipedia_quotient_rule"/>
     <w:p>
       <w:pPr>
         <w:pStyle w:val="Bibliography"/>
@@ -58418,7 +58418,7 @@
       <w:r>
         <w:t xml:space="preserve"> </w:t>
       </w:r>
-      <w:hyperlink r:id="rId217">
+      <w:hyperlink r:id="rId220">
         <w:r>
           <w:rPr>
             <w:rStyle w:val="Hyperlink"/>
@@ -58427,8 +58427,8 @@
         </w:r>
       </w:hyperlink>
     </w:p>
-    <w:bookmarkEnd w:id="218"/>
-    <w:bookmarkStart w:id="220" w:name="ref-wikipedia_chain_rule"/>
+    <w:bookmarkEnd w:id="221"/>
+    <w:bookmarkStart w:id="223" w:name="ref-wikipedia_chain_rule"/>
     <w:p>
       <w:pPr>
         <w:pStyle w:val="Bibliography"/>
@@ -58475,7 +58475,7 @@
       <w:r>
         <w:t xml:space="preserve"> </w:t>
       </w:r>
-      <w:hyperlink r:id="rId219">
+      <w:hyperlink r:id="rId222">
         <w:r>
           <w:rPr>
             <w:rStyle w:val="Hyperlink"/>
@@ -58484,8 +58484,8 @@
         </w:r>
       </w:hyperlink>
     </w:p>
-    <w:bookmarkEnd w:id="220"/>
-    <w:bookmarkStart w:id="222" w:name="ref-wikipedia_linear_approximation"/>
+    <w:bookmarkEnd w:id="223"/>
+    <w:bookmarkStart w:id="225" w:name="ref-wikipedia_linear_approximation"/>
     <w:p>
       <w:pPr>
         <w:pStyle w:val="Bibliography"/>
@@ -58532,7 +58532,7 @@
       <w:r>
         <w:t xml:space="preserve"> </w:t>
       </w:r>
-      <w:hyperlink r:id="rId221">
+      <w:hyperlink r:id="rId224">
         <w:r>
           <w:rPr>
             <w:rStyle w:val="Hyperlink"/>
@@ -58541,8 +58541,8 @@
         </w:r>
       </w:hyperlink>
     </w:p>
-    <w:bookmarkEnd w:id="222"/>
-    <w:bookmarkStart w:id="224" w:name="ref-boyd2018vmls"/>
+    <w:bookmarkEnd w:id="225"/>
+    <w:bookmarkStart w:id="227" w:name="ref-boyd2018vmls"/>
     <w:p>
       <w:pPr>
         <w:pStyle w:val="Bibliography"/>
@@ -58575,7 +58575,7 @@
       <w:r>
         <w:t xml:space="preserve"> </w:t>
       </w:r>
-      <w:hyperlink r:id="rId223">
+      <w:hyperlink r:id="rId226">
         <w:r>
           <w:rPr>
             <w:rStyle w:val="Hyperlink"/>
@@ -58587,8 +58587,8 @@
         <w:t xml:space="preserve">.</w:t>
       </w:r>
     </w:p>
-    <w:bookmarkEnd w:id="224"/>
-    <w:bookmarkStart w:id="226" w:name="ref-wikipedia_stationary_point"/>
+    <w:bookmarkEnd w:id="227"/>
+    <w:bookmarkStart w:id="229" w:name="ref-wikipedia_stationary_point"/>
     <w:p>
       <w:pPr>
         <w:pStyle w:val="Bibliography"/>
@@ -58635,7 +58635,7 @@
       <w:r>
         <w:t xml:space="preserve"> </w:t>
       </w:r>
-      <w:hyperlink r:id="rId225">
+      <w:hyperlink r:id="rId228">
         <w:r>
           <w:rPr>
             <w:rStyle w:val="Hyperlink"/>
@@ -58644,10 +58644,10 @@
         </w:r>
       </w:hyperlink>
     </w:p>
-    <w:bookmarkEnd w:id="226"/>
-    <w:bookmarkEnd w:id="227"/>
-    <w:bookmarkEnd w:id="228"/>
     <w:bookmarkEnd w:id="229"/>
+    <w:bookmarkEnd w:id="230"/>
+    <w:bookmarkEnd w:id="231"/>
+    <w:bookmarkEnd w:id="232"/>
     <w:sectPr>
       <w:footnotePr>
         <w:numRestart w:val="eachSect"/>

</xml_diff>

<commit_message>
Deploying to gh-pages from @ Morrison-Lab/mds@4f482602038112af9e9b468aec1a2c5d88d9afba 🚀
</commit_message>
<xml_diff>
--- a/calculus-derivatives.docx
+++ b/calculus-derivatives.docx
@@ -15,10 +15,10 @@
         <w:pStyle w:val="Date"/>
       </w:pPr>
       <w:r>
-        <w:t xml:space="preserve">Last modified: 2026-10-28 21:37:44 (PDT)</w:t>
+        <w:t xml:space="preserve">Last modified: 2026-10-28 23:05:07 (PDT)</w:t>
       </w:r>
     </w:p>
-    <w:bookmarkStart w:id="211" w:name="sec-derivatives"/>
+    <w:bookmarkStart w:id="219" w:name="sec-derivatives"/>
     <w:p>
       <w:pPr>
         <w:pStyle w:val="Heading2"/>
@@ -31827,7 +31827,7 @@
     </w:p>
     <w:bookmarkEnd w:id="124"/>
     <w:bookmarkEnd w:id="125"/>
-    <w:bookmarkStart w:id="134" w:name="sec-linear-approximation"/>
+    <w:bookmarkStart w:id="142" w:name="sec-linear-approximation"/>
     <w:p>
       <w:pPr>
         <w:pStyle w:val="Heading3"/>
@@ -32949,14 +32949,10 @@
     </w:p>
     <w:p>
       <w:pPr>
-        <w:pStyle w:val="Compact"/>
-        <w:numPr>
-          <w:ilvl w:val="0"/>
-          <w:numId w:val="1014"/>
-        </w:numPr>
+        <w:pStyle w:val="BodyText"/>
       </w:pPr>
       <w:r>
-        <w:t xml:space="preserve">Compute</w:t>
+        <w:t xml:space="preserve">Find</w:t>
       </w:r>
       <w:r>
         <w:t xml:space="preserve"> </w:t>
@@ -32997,146 +32993,11 @@
         <w:t xml:space="preserve">.</w:t>
       </w:r>
     </w:p>
+    <w:bookmarkEnd w:id="132"/>
+    <w:bookmarkStart w:id="134" w:name="sol-miller-deriv-tangent-line-approx"/>
     <w:p>
       <w:pPr>
-        <w:pStyle w:val="Compact"/>
-        <w:numPr>
-          <w:ilvl w:val="0"/>
-          <w:numId w:val="1014"/>
-        </w:numPr>
-      </w:pPr>
-      <w:r>
-        <w:t xml:space="preserve">Find the equation of the tangent line to the curve</w:t>
-      </w:r>
-      <w:r>
-        <w:t xml:space="preserve"> </w:t>
-      </w:r>
-      <m:oMath>
-        <m:r>
-          <m:t>y</m:t>
-        </m:r>
-        <m:r>
-          <m:rPr>
-            <m:sty m:val="p"/>
-          </m:rPr>
-          <m:t>=</m:t>
-        </m:r>
-        <m:r>
-          <m:t>f</m:t>
-        </m:r>
-        <m:r>
-          <m:rPr>
-            <m:sty m:val="p"/>
-          </m:rPr>
-          <m:t>(</m:t>
-        </m:r>
-        <m:r>
-          <m:t>x</m:t>
-        </m:r>
-        <m:r>
-          <m:rPr>
-            <m:sty m:val="p"/>
-          </m:rPr>
-          <m:t>)</m:t>
-        </m:r>
-      </m:oMath>
-      <w:r>
-        <w:t xml:space="preserve"> </w:t>
-      </w:r>
-      <w:r>
-        <w:t xml:space="preserve">at</w:t>
-      </w:r>
-      <w:r>
-        <w:t xml:space="preserve"> </w:t>
-      </w:r>
-      <m:oMath>
-        <m:r>
-          <m:t>x</m:t>
-        </m:r>
-        <m:r>
-          <m:rPr>
-            <m:sty m:val="p"/>
-          </m:rPr>
-          <m:t>=</m:t>
-        </m:r>
-        <m:r>
-          <m:t>π</m:t>
-        </m:r>
-        <m:r>
-          <m:rPr>
-            <m:sty m:val="p"/>
-          </m:rPr>
-          <m:t>/</m:t>
-        </m:r>
-        <m:r>
-          <m:t>4</m:t>
-        </m:r>
-      </m:oMath>
-      <w:r>
-        <w:t xml:space="preserve">.</w:t>
-      </w:r>
-    </w:p>
-    <w:p>
-      <w:pPr>
-        <w:pStyle w:val="Compact"/>
-        <w:numPr>
-          <w:ilvl w:val="0"/>
-          <w:numId w:val="1014"/>
-        </w:numPr>
-      </w:pPr>
-      <w:r>
-        <w:t xml:space="preserve">Use the tangent line to approximate</w:t>
-      </w:r>
-      <w:r>
-        <w:t xml:space="preserve"> </w:t>
-      </w:r>
-      <m:oMath>
-        <m:r>
-          <m:t>f</m:t>
-        </m:r>
-        <m:r>
-          <m:rPr>
-            <m:sty m:val="p"/>
-          </m:rPr>
-          <m:t>(</m:t>
-        </m:r>
-        <m:r>
-          <m:t>π</m:t>
-        </m:r>
-        <m:r>
-          <m:rPr>
-            <m:sty m:val="p"/>
-          </m:rPr>
-          <m:t>/</m:t>
-        </m:r>
-        <m:r>
-          <m:t>4</m:t>
-        </m:r>
-        <m:r>
-          <m:rPr>
-            <m:sty m:val="p"/>
-          </m:rPr>
-          <m:t>+</m:t>
-        </m:r>
-        <m:r>
-          <m:t>0.01</m:t>
-        </m:r>
-        <m:r>
-          <m:rPr>
-            <m:sty m:val="p"/>
-          </m:rPr>
-          <m:t>)</m:t>
-        </m:r>
-      </m:oMath>
-      <w:r>
-        <w:t xml:space="preserve">, and compare that approximation with the exact value.</w:t>
-      </w:r>
-    </w:p>
-    <w:bookmarkEnd w:id="132"/>
-    <w:bookmarkStart w:id="133" w:name="sol-miller-deriv-tangent-line-approx"/>
-    <w:p>
-      <w:pPr>
-        <w:pStyle w:val="FirstParagraph"/>
+        <w:pStyle w:val="BodyText"/>
       </w:pPr>
       <w:r>
         <w:rPr>
@@ -33149,17 +33010,21 @@
         <w:t xml:space="preserve">. </w:t>
       </w:r>
       <w:r>
-        <w:rPr>
-          <w:b/>
-          <w:bCs/>
-        </w:rPr>
-        <w:t xml:space="preserve">1.</w:t>
-      </w:r>
-      <w:r>
-        <w:t xml:space="preserve"> </w:t>
-      </w:r>
-      <w:r>
-        <w:t xml:space="preserve">Differentiate term by term:</w:t>
+        <w:t xml:space="preserve">Differentiate each</w:t>
+      </w:r>
+      <w:r>
+        <w:t xml:space="preserve"> </w:t>
+      </w:r>
+      <w:hyperlink r:id="rId133">
+        <w:r>
+          <w:rPr>
+            <w:rStyle w:val="Hyperlink"/>
+          </w:rPr>
+          <w:t xml:space="preserve">term</w:t>
+        </w:r>
+      </w:hyperlink>
+      <w:r>
+        <w:t xml:space="preserve">:</w:t>
       </w:r>
     </w:p>
     <w:p>
@@ -33239,6 +33104,8 @@
         </m:oMath>
       </m:oMathPara>
     </w:p>
+    <w:bookmarkEnd w:id="134"/>
+    <w:bookmarkStart w:id="135" w:name="Xd505b5f66036dbd04a1b637d9048005db234487"/>
     <w:p>
       <w:pPr>
         <w:pStyle w:val="FirstParagraph"/>
@@ -33248,10 +33115,134 @@
           <w:b/>
           <w:bCs/>
         </w:rPr>
-        <w:t xml:space="preserve">2.</w:t>
-      </w:r>
-      <w:r>
-        <w:t xml:space="preserve"> </w:t>
+        <w:t xml:space="preserve">Exercise 14 (Tangent line at a point)</w:t>
+      </w:r>
+      <w:r>
+        <w:t xml:space="preserve"> </w:t>
+      </w:r>
+      <w:r>
+        <w:t xml:space="preserve">In the setting of</w:t>
+      </w:r>
+      <w:r>
+        <w:t xml:space="preserve"> </w:t>
+      </w:r>
+      <w:hyperlink w:anchor="exr-miller-deriv-tangent-line-approx">
+        <w:r>
+          <w:rPr>
+            <w:rStyle w:val="Hyperlink"/>
+          </w:rPr>
+          <w:t xml:space="preserve">Exercise 13</w:t>
+        </w:r>
+      </w:hyperlink>
+      <w:r>
+        <w:t xml:space="preserve">,</w:t>
+      </w:r>
+      <w:r>
+        <w:t xml:space="preserve"> </w:t>
+      </w:r>
+      <w:r>
+        <w:t xml:space="preserve">find the equation of the</w:t>
+      </w:r>
+      <w:r>
+        <w:t xml:space="preserve"> </w:t>
+      </w:r>
+      <w:hyperlink w:anchor="def-tangent-line">
+        <w:r>
+          <w:rPr>
+            <w:rStyle w:val="Hyperlink"/>
+          </w:rPr>
+          <w:t xml:space="preserve">tangent line</w:t>
+        </w:r>
+      </w:hyperlink>
+      <w:r>
+        <w:t xml:space="preserve"> </w:t>
+      </w:r>
+      <w:r>
+        <w:t xml:space="preserve">to the curve</w:t>
+      </w:r>
+      <w:r>
+        <w:t xml:space="preserve"> </w:t>
+      </w:r>
+      <m:oMath>
+        <m:r>
+          <m:t>y</m:t>
+        </m:r>
+        <m:r>
+          <m:rPr>
+            <m:sty m:val="p"/>
+          </m:rPr>
+          <m:t>=</m:t>
+        </m:r>
+        <m:r>
+          <m:t>f</m:t>
+        </m:r>
+        <m:r>
+          <m:rPr>
+            <m:sty m:val="p"/>
+          </m:rPr>
+          <m:t>(</m:t>
+        </m:r>
+        <m:r>
+          <m:t>x</m:t>
+        </m:r>
+        <m:r>
+          <m:rPr>
+            <m:sty m:val="p"/>
+          </m:rPr>
+          <m:t>)</m:t>
+        </m:r>
+      </m:oMath>
+      <w:r>
+        <w:t xml:space="preserve"> </w:t>
+      </w:r>
+      <w:r>
+        <w:t xml:space="preserve">at</w:t>
+      </w:r>
+      <w:r>
+        <w:t xml:space="preserve"> </w:t>
+      </w:r>
+      <m:oMath>
+        <m:r>
+          <m:t>x</m:t>
+        </m:r>
+        <m:r>
+          <m:rPr>
+            <m:sty m:val="p"/>
+          </m:rPr>
+          <m:t>=</m:t>
+        </m:r>
+        <m:r>
+          <m:t>π</m:t>
+        </m:r>
+        <m:r>
+          <m:rPr>
+            <m:sty m:val="p"/>
+          </m:rPr>
+          <m:t>/</m:t>
+        </m:r>
+        <m:r>
+          <m:t>4</m:t>
+        </m:r>
+      </m:oMath>
+      <w:r>
+        <w:t xml:space="preserve">.</w:t>
+      </w:r>
+    </w:p>
+    <w:bookmarkEnd w:id="135"/>
+    <w:bookmarkStart w:id="136" w:name="X7361b8b0ed85cefd15eeed7a74aed24da3bb994"/>
+    <w:p>
+      <w:pPr>
+        <w:pStyle w:val="BodyText"/>
+      </w:pPr>
+      <w:r>
+        <w:rPr>
+          <w:i/>
+          <w:iCs/>
+        </w:rPr>
+        <w:t xml:space="preserve">Solution 14</w:t>
+      </w:r>
+      <w:r>
+        <w:t xml:space="preserve">. </w:t>
       </w:r>
       <w:r>
         <w:t xml:space="preserve">Evaluate</w:t>
@@ -34013,6 +34004,8 @@
         </m:oMath>
       </m:oMathPara>
     </w:p>
+    <w:bookmarkEnd w:id="136"/>
+    <w:bookmarkStart w:id="137" w:name="X3d80d085e29e188c88c8a329644e0fa32110b7b"/>
     <w:p>
       <w:pPr>
         <w:pStyle w:val="FirstParagraph"/>
@@ -34022,10 +34015,108 @@
           <w:b/>
           <w:bCs/>
         </w:rPr>
-        <w:t xml:space="preserve">3.</w:t>
-      </w:r>
-      <w:r>
-        <w:t xml:space="preserve"> </w:t>
+        <w:t xml:space="preserve">Exercise 15 (Approximate with the tangent line)</w:t>
+      </w:r>
+      <w:r>
+        <w:t xml:space="preserve"> </w:t>
+      </w:r>
+      <w:r>
+        <w:t xml:space="preserve">Use the</w:t>
+      </w:r>
+      <w:r>
+        <w:t xml:space="preserve"> </w:t>
+      </w:r>
+      <w:hyperlink w:anchor="def-tangent-line">
+        <w:r>
+          <w:rPr>
+            <w:rStyle w:val="Hyperlink"/>
+          </w:rPr>
+          <w:t xml:space="preserve">tangent line</w:t>
+        </w:r>
+      </w:hyperlink>
+      <w:r>
+        <w:t xml:space="preserve"> </w:t>
+      </w:r>
+      <w:r>
+        <w:t xml:space="preserve">from</w:t>
+      </w:r>
+      <w:r>
+        <w:t xml:space="preserve"> </w:t>
+      </w:r>
+      <w:hyperlink w:anchor="Xd505b5f66036dbd04a1b637d9048005db234487">
+        <w:r>
+          <w:rPr>
+            <w:rStyle w:val="Hyperlink"/>
+          </w:rPr>
+          <w:t xml:space="preserve">Exercise 14</w:t>
+        </w:r>
+      </w:hyperlink>
+      <w:r>
+        <w:t xml:space="preserve"> </w:t>
+      </w:r>
+      <w:r>
+        <w:t xml:space="preserve">to approximate</w:t>
+      </w:r>
+      <w:r>
+        <w:t xml:space="preserve"> </w:t>
+      </w:r>
+      <m:oMath>
+        <m:r>
+          <m:t>f</m:t>
+        </m:r>
+        <m:r>
+          <m:rPr>
+            <m:sty m:val="p"/>
+          </m:rPr>
+          <m:t>(</m:t>
+        </m:r>
+        <m:r>
+          <m:t>π</m:t>
+        </m:r>
+        <m:r>
+          <m:rPr>
+            <m:sty m:val="p"/>
+          </m:rPr>
+          <m:t>/</m:t>
+        </m:r>
+        <m:r>
+          <m:t>4</m:t>
+        </m:r>
+        <m:r>
+          <m:rPr>
+            <m:sty m:val="p"/>
+          </m:rPr>
+          <m:t>+</m:t>
+        </m:r>
+        <m:r>
+          <m:t>0.01</m:t>
+        </m:r>
+        <m:r>
+          <m:rPr>
+            <m:sty m:val="p"/>
+          </m:rPr>
+          <m:t>)</m:t>
+        </m:r>
+      </m:oMath>
+      <w:r>
+        <w:t xml:space="preserve">.</w:t>
+      </w:r>
+    </w:p>
+    <w:bookmarkEnd w:id="137"/>
+    <w:bookmarkStart w:id="138" w:name="X5699754f53237d41bb9abf45799198b2143d955"/>
+    <w:p>
+      <w:pPr>
+        <w:pStyle w:val="BodyText"/>
+      </w:pPr>
+      <w:r>
+        <w:rPr>
+          <w:i/>
+          <w:iCs/>
+        </w:rPr>
+        <w:t xml:space="preserve">Solution 15</w:t>
+      </w:r>
+      <w:r>
+        <w:t xml:space="preserve">. </w:t>
       </w:r>
       <w:r>
         <w:t xml:space="preserve">At</w:t>
@@ -34066,7 +34157,24 @@
         </m:r>
       </m:oMath>
       <w:r>
-        <w:t xml:space="preserve">, the linear approximation (</w:t>
+        <w:t xml:space="preserve">, the</w:t>
+      </w:r>
+      <w:r>
+        <w:t xml:space="preserve"> </w:t>
+      </w:r>
+      <w:hyperlink w:anchor="def-linear-approximation">
+        <w:r>
+          <w:rPr>
+            <w:rStyle w:val="Hyperlink"/>
+          </w:rPr>
+          <w:t xml:space="preserve">linear approximation</w:t>
+        </w:r>
+      </w:hyperlink>
+      <w:r>
+        <w:t xml:space="preserve"> </w:t>
+      </w:r>
+      <w:r>
+        <w:t xml:space="preserve">(</w:t>
       </w:r>
       <w:hyperlink w:anchor="eq-linear-approx">
         <w:r>
@@ -34209,12 +34317,139 @@
         </m:oMath>
       </m:oMathPara>
     </w:p>
+    <w:bookmarkEnd w:id="138"/>
+    <w:bookmarkStart w:id="140" w:name="X0d8a6c6a665064568e8f1868e2404ba30649b65"/>
     <w:p>
       <w:pPr>
         <w:pStyle w:val="FirstParagraph"/>
       </w:pPr>
       <w:r>
-        <w:t xml:space="preserve">The exact value is:</w:t>
+        <w:rPr>
+          <w:b/>
+          <w:bCs/>
+        </w:rPr>
+        <w:t xml:space="preserve">Exercise 16 (Check the approximation)</w:t>
+      </w:r>
+      <w:r>
+        <w:t xml:space="preserve"> </w:t>
+      </w:r>
+      <w:r>
+        <w:t xml:space="preserve">Compare the approximation in</w:t>
+      </w:r>
+      <w:r>
+        <w:t xml:space="preserve"> </w:t>
+      </w:r>
+      <w:hyperlink w:anchor="X3d80d085e29e188c88c8a329644e0fa32110b7b">
+        <w:r>
+          <w:rPr>
+            <w:rStyle w:val="Hyperlink"/>
+          </w:rPr>
+          <w:t xml:space="preserve">Exercise 15</w:t>
+        </w:r>
+      </w:hyperlink>
+      <w:r>
+        <w:t xml:space="preserve"> </w:t>
+      </w:r>
+      <w:r>
+        <w:t xml:space="preserve">with the exact</w:t>
+      </w:r>
+      <w:r>
+        <w:t xml:space="preserve"> </w:t>
+      </w:r>
+      <w:hyperlink r:id="rId139">
+        <w:r>
+          <w:rPr>
+            <w:rStyle w:val="Hyperlink"/>
+          </w:rPr>
+          <w:t xml:space="preserve">value</w:t>
+        </w:r>
+      </w:hyperlink>
+      <w:r>
+        <w:t xml:space="preserve"> </w:t>
+      </w:r>
+      <w:r>
+        <w:t xml:space="preserve">of</w:t>
+      </w:r>
+      <w:r>
+        <w:t xml:space="preserve"> </w:t>
+      </w:r>
+      <m:oMath>
+        <m:r>
+          <m:t>f</m:t>
+        </m:r>
+        <m:r>
+          <m:rPr>
+            <m:sty m:val="p"/>
+          </m:rPr>
+          <m:t>(</m:t>
+        </m:r>
+        <m:r>
+          <m:t>π</m:t>
+        </m:r>
+        <m:r>
+          <m:rPr>
+            <m:sty m:val="p"/>
+          </m:rPr>
+          <m:t>/</m:t>
+        </m:r>
+        <m:r>
+          <m:t>4</m:t>
+        </m:r>
+        <m:r>
+          <m:rPr>
+            <m:sty m:val="p"/>
+          </m:rPr>
+          <m:t>+</m:t>
+        </m:r>
+        <m:r>
+          <m:t>0.01</m:t>
+        </m:r>
+        <m:r>
+          <m:rPr>
+            <m:sty m:val="p"/>
+          </m:rPr>
+          <m:t>)</m:t>
+        </m:r>
+      </m:oMath>
+      <w:r>
+        <w:t xml:space="preserve">.</w:t>
+      </w:r>
+    </w:p>
+    <w:bookmarkEnd w:id="140"/>
+    <w:bookmarkStart w:id="141" w:name="X3a0e4890abf193bee079c2ee1b8175f81def6f3"/>
+    <w:p>
+      <w:pPr>
+        <w:pStyle w:val="BodyText"/>
+      </w:pPr>
+      <w:r>
+        <w:rPr>
+          <w:i/>
+          <w:iCs/>
+        </w:rPr>
+        <w:t xml:space="preserve">Solution 16</w:t>
+      </w:r>
+      <w:r>
+        <w:t xml:space="preserve">. </w:t>
+      </w:r>
+      <w:r>
+        <w:t xml:space="preserve">The exact</w:t>
+      </w:r>
+      <w:r>
+        <w:t xml:space="preserve"> </w:t>
+      </w:r>
+      <w:hyperlink r:id="rId139">
+        <w:r>
+          <w:rPr>
+            <w:rStyle w:val="Hyperlink"/>
+          </w:rPr>
+          <w:t xml:space="preserve">value</w:t>
+        </w:r>
+      </w:hyperlink>
+      <w:r>
+        <w:t xml:space="preserve"> </w:t>
+      </w:r>
+      <w:r>
+        <w:t xml:space="preserve">is:</w:t>
       </w:r>
     </w:p>
     <w:p>
@@ -34491,9 +34726,9 @@
         <w:t xml:space="preserve">.</w:t>
       </w:r>
     </w:p>
-    <w:bookmarkEnd w:id="133"/>
-    <w:bookmarkEnd w:id="134"/>
-    <w:bookmarkStart w:id="210" w:name="sec-taylor-series"/>
+    <w:bookmarkEnd w:id="141"/>
+    <w:bookmarkEnd w:id="142"/>
+    <w:bookmarkStart w:id="218" w:name="sec-taylor-series"/>
     <w:p>
       <w:pPr>
         <w:pStyle w:val="Heading3"/>
@@ -34502,7 +34737,7 @@
         <w:t xml:space="preserve">1.6 Taylor series</w:t>
       </w:r>
     </w:p>
-    <w:bookmarkStart w:id="136" w:name="def-taylor-polynomial"/>
+    <w:bookmarkStart w:id="144" w:name="def-taylor-polynomial"/>
     <w:p>
       <w:pPr>
         <w:pStyle w:val="FirstParagraph"/>
@@ -34646,7 +34881,7 @@
       <w:pPr>
         <w:pStyle w:val="BodyText"/>
       </w:pPr>
-      <w:bookmarkStart w:id="135" w:name="eq-taylor-poly-def"/>
+      <w:bookmarkStart w:id="143" w:name="eq-taylor-poly-def"/>
       <m:oMathPara>
         <m:oMathParaPr>
           <m:jc m:val="center"/>
@@ -35196,10 +35431,10 @@
           </m:r>
         </m:oMath>
       </m:oMathPara>
-      <w:bookmarkEnd w:id="135"/>
+      <w:bookmarkEnd w:id="143"/>
     </w:p>
-    <w:bookmarkEnd w:id="136"/>
-    <w:bookmarkStart w:id="137" w:name="exm-taylor-polynomial-exponential"/>
+    <w:bookmarkEnd w:id="144"/>
+    <w:bookmarkStart w:id="145" w:name="exm-taylor-polynomial-exponential"/>
     <w:p>
       <w:pPr>
         <w:pStyle w:val="FirstParagraph"/>
@@ -35844,8 +36079,8 @@
         </m:oMath>
       </m:oMathPara>
     </w:p>
-    <w:bookmarkEnd w:id="137"/>
-    <w:bookmarkStart w:id="138" w:name="def-maclaurin-polynomial"/>
+    <w:bookmarkEnd w:id="145"/>
+    <w:bookmarkStart w:id="146" w:name="def-maclaurin-polynomial"/>
     <w:p>
       <w:pPr>
         <w:pStyle w:val="FirstParagraph"/>
@@ -35955,8 +36190,8 @@
         <w:t xml:space="preserve">.</w:t>
       </w:r>
     </w:p>
-    <w:bookmarkEnd w:id="138"/>
-    <w:bookmarkStart w:id="139" w:name="def-taylor-series"/>
+    <w:bookmarkEnd w:id="146"/>
+    <w:bookmarkStart w:id="147" w:name="def-taylor-series"/>
     <w:p>
       <w:pPr>
         <w:pStyle w:val="BodyText"/>
@@ -36296,7 +36531,7 @@
         <w:t xml:space="preserve">.</w:t>
       </w:r>
     </w:p>
-    <w:bookmarkEnd w:id="139"/>
+    <w:bookmarkEnd w:id="147"/>
     <w:tbl>
       <w:tblPr>
         <w:tblStyle w:val="Table"/>
@@ -36338,12 +36573,12 @@
                 <wp:inline>
                   <wp:extent cx="152400" cy="152400"/>
                   <wp:effectExtent b="0" l="0" r="0" t="0"/>
-                  <wp:docPr descr="" title="" id="140" name="Picture"/>
+                  <wp:docPr descr="" title="" id="148" name="Picture"/>
                   <a:graphic>
                     <a:graphicData uri="http://schemas.openxmlformats.org/drawingml/2006/picture">
                       <pic:pic>
                         <pic:nvPicPr>
-                          <pic:cNvPr descr="/opt/quarto/share/formats/docx/tip.png" id="141" name="Picture"/>
+                          <pic:cNvPr descr="/opt/quarto/share/formats/docx/tip.png" id="149" name="Picture"/>
                           <pic:cNvPicPr>
                             <a:picLocks noChangeArrowheads="1" noChangeAspect="1"/>
                           </pic:cNvPicPr>
@@ -36411,7 +36646,7 @@
             <w:r>
               <w:t xml:space="preserve"> </w:t>
             </w:r>
-            <w:hyperlink r:id="rId142">
+            <w:hyperlink r:id="rId150">
               <w:r>
                 <w:rPr>
                   <w:rStyle w:val="Hyperlink"/>
@@ -36439,10 +36674,10 @@
               <w:pStyle w:val="Compact"/>
               <w:numPr>
                 <w:ilvl w:val="0"/>
-                <w:numId w:val="1015"/>
+                <w:numId w:val="1014"/>
               </w:numPr>
             </w:pPr>
-            <w:hyperlink r:id="rId143">
+            <w:hyperlink r:id="rId151">
               <w:r>
                 <w:rPr>
                   <w:rStyle w:val="Hyperlink"/>
@@ -36472,7 +36707,7 @@
         </w:tc>
       </w:tr>
     </w:tbl>
-    <w:bookmarkStart w:id="144" w:name="exr-miller-taylor-poly-zero"/>
+    <w:bookmarkStart w:id="152" w:name="exr-miller-taylor-poly-zero"/>
     <w:p>
       <w:pPr>
         <w:pStyle w:val="FirstParagraph"/>
@@ -36482,7 +36717,7 @@
           <w:b/>
           <w:bCs/>
         </w:rPr>
-        <w:t xml:space="preserve">Exercise 14 (Taylor polynomial of a polynomial at the origin)</w:t>
+        <w:t xml:space="preserve">Exercise 17 (Taylor polynomial of a polynomial at the origin)</w:t>
       </w:r>
       <w:r>
         <w:t xml:space="preserve"> </w:t>
@@ -36620,8 +36855,8 @@
         <w:t xml:space="preserve">.</w:t>
       </w:r>
     </w:p>
-    <w:bookmarkEnd w:id="144"/>
-    <w:bookmarkStart w:id="145" w:name="sol-miller-taylor-poly-zero"/>
+    <w:bookmarkEnd w:id="152"/>
+    <w:bookmarkStart w:id="153" w:name="sol-miller-taylor-poly-zero"/>
     <w:p>
       <w:pPr>
         <w:pStyle w:val="BodyText"/>
@@ -36631,7 +36866,7 @@
           <w:i/>
           <w:iCs/>
         </w:rPr>
-        <w:t xml:space="preserve">Solution 14</w:t>
+        <w:t xml:space="preserve">Solution 17</w:t>
       </w:r>
       <w:r>
         <w:t xml:space="preserve">. </w:t>
@@ -37575,8 +37810,8 @@
         <w:t xml:space="preserve">, its Taylor polynomial of degree 4 simply collects its terms of degree at most 4.</w:t>
       </w:r>
     </w:p>
-    <w:bookmarkEnd w:id="145"/>
-    <w:bookmarkStart w:id="146" w:name="exr-miller-taylor-poly-nonzero"/>
+    <w:bookmarkEnd w:id="153"/>
+    <w:bookmarkStart w:id="154" w:name="exr-miller-taylor-poly-nonzero"/>
     <w:p>
       <w:pPr>
         <w:pStyle w:val="BodyText"/>
@@ -37586,7 +37821,7 @@
           <w:b/>
           <w:bCs/>
         </w:rPr>
-        <w:t xml:space="preserve">Exercise 15 (Taylor expansion of a polynomial at a nonzero point)</w:t>
+        <w:t xml:space="preserve">Exercise 18 (Taylor expansion of a polynomial at a nonzero point)</w:t>
       </w:r>
       <w:r>
         <w:t xml:space="preserve"> </w:t>
@@ -37724,8 +37959,8 @@
         <w:t xml:space="preserve">.</w:t>
       </w:r>
     </w:p>
-    <w:bookmarkEnd w:id="146"/>
-    <w:bookmarkStart w:id="147" w:name="sol-miller-taylor-poly-nonzero"/>
+    <w:bookmarkEnd w:id="154"/>
+    <w:bookmarkStart w:id="155" w:name="sol-miller-taylor-poly-nonzero"/>
     <w:p>
       <w:pPr>
         <w:pStyle w:val="BodyText"/>
@@ -37735,7 +37970,7 @@
           <w:i/>
           <w:iCs/>
         </w:rPr>
-        <w:t xml:space="preserve">Solution 15</w:t>
+        <w:t xml:space="preserve">Solution 18</w:t>
       </w:r>
       <w:r>
         <w:t xml:space="preserve">. </w:t>
@@ -38427,8 +38662,8 @@
         </m:oMath>
       </m:oMathPara>
     </w:p>
-    <w:bookmarkEnd w:id="147"/>
-    <w:bookmarkStart w:id="148" w:name="exm-taylor-polynomial-cosine"/>
+    <w:bookmarkEnd w:id="155"/>
+    <w:bookmarkStart w:id="156" w:name="exm-taylor-polynomial-cosine"/>
     <w:p>
       <w:pPr>
         <w:pStyle w:val="FirstParagraph"/>
@@ -39357,8 +39592,8 @@
         </m:oMath>
       </m:oMathPara>
     </w:p>
-    <w:bookmarkEnd w:id="148"/>
-    <w:bookmarkStart w:id="149" w:name="exm-taylor-polynomial-sine"/>
+    <w:bookmarkEnd w:id="156"/>
+    <w:bookmarkStart w:id="157" w:name="exm-taylor-polynomial-sine"/>
     <w:p>
       <w:pPr>
         <w:pStyle w:val="FirstParagraph"/>
@@ -39963,8 +40198,8 @@
         </m:oMath>
       </m:oMathPara>
     </w:p>
-    <w:bookmarkEnd w:id="149"/>
-    <w:bookmarkStart w:id="150" w:name="exr-miller-taylor-cos-scaled"/>
+    <w:bookmarkEnd w:id="157"/>
+    <w:bookmarkStart w:id="158" w:name="exr-miller-taylor-cos-scaled"/>
     <w:p>
       <w:pPr>
         <w:pStyle w:val="FirstParagraph"/>
@@ -39974,7 +40209,7 @@
           <w:b/>
           <w:bCs/>
         </w:rPr>
-        <w:t xml:space="preserve">Exercise 16 (Taylor expansion of a scaled cosine)</w:t>
+        <w:t xml:space="preserve">Exercise 19 (Taylor expansion of a scaled cosine)</w:t>
       </w:r>
       <w:r>
         <w:t xml:space="preserve"> </w:t>
@@ -40097,8 +40332,8 @@
         <w:t xml:space="preserve">.</w:t>
       </w:r>
     </w:p>
-    <w:bookmarkEnd w:id="150"/>
-    <w:bookmarkStart w:id="151" w:name="sol-miller-taylor-cos-scaled"/>
+    <w:bookmarkEnd w:id="158"/>
+    <w:bookmarkStart w:id="159" w:name="sol-miller-taylor-cos-scaled"/>
     <w:p>
       <w:pPr>
         <w:pStyle w:val="BodyText"/>
@@ -40108,7 +40343,7 @@
           <w:i/>
           <w:iCs/>
         </w:rPr>
-        <w:t xml:space="preserve">Solution 16</w:t>
+        <w:t xml:space="preserve">Solution 19</w:t>
       </w:r>
       <w:r>
         <w:t xml:space="preserve">. </w:t>
@@ -40538,8 +40773,8 @@
         <w:t xml:space="preserve">Substituting into known Taylor expansions avoids computing high-order derivatives by hand.</w:t>
       </w:r>
     </w:p>
-    <w:bookmarkEnd w:id="151"/>
-    <w:bookmarkStart w:id="152" w:name="exr-miller-taylor-cos-cubed"/>
+    <w:bookmarkEnd w:id="159"/>
+    <w:bookmarkStart w:id="160" w:name="exr-miller-taylor-cos-cubed"/>
     <w:p>
       <w:pPr>
         <w:pStyle w:val="BodyText"/>
@@ -40549,7 +40784,7 @@
           <w:b/>
           <w:bCs/>
         </w:rPr>
-        <w:t xml:space="preserve">Exercise 17 (Taylor series of a power of a function)</w:t>
+        <w:t xml:space="preserve">Exercise 20 (Taylor series of a power of a function)</w:t>
       </w:r>
       <w:r>
         <w:t xml:space="preserve"> </w:t>
@@ -40681,8 +40916,8 @@
         <w:t xml:space="preserve">.</w:t>
       </w:r>
     </w:p>
-    <w:bookmarkEnd w:id="152"/>
-    <w:bookmarkStart w:id="153" w:name="sol-miller-taylor-cos-cubed"/>
+    <w:bookmarkEnd w:id="160"/>
+    <w:bookmarkStart w:id="161" w:name="sol-miller-taylor-cos-cubed"/>
     <w:p>
       <w:pPr>
         <w:pStyle w:val="BodyText"/>
@@ -40692,7 +40927,7 @@
           <w:i/>
           <w:iCs/>
         </w:rPr>
-        <w:t xml:space="preserve">Solution 17</w:t>
+        <w:t xml:space="preserve">Solution 20</w:t>
       </w:r>
       <w:r>
         <w:t xml:space="preserve">. </w:t>
@@ -40708,7 +40943,7 @@
           <w:rPr>
             <w:rStyle w:val="Hyperlink"/>
           </w:rPr>
-          <w:t xml:space="preserve">Exercise 16</w:t>
+          <w:t xml:space="preserve">Exercise 19</w:t>
         </w:r>
       </w:hyperlink>
       <w:r>
@@ -41605,8 +41840,8 @@
         </m:oMath>
       </m:oMathPara>
     </w:p>
-    <w:bookmarkEnd w:id="153"/>
-    <w:bookmarkStart w:id="154" w:name="exr-miller-taylor-exp-base"/>
+    <w:bookmarkEnd w:id="161"/>
+    <w:bookmarkStart w:id="162" w:name="exr-miller-taylor-exp-base"/>
     <w:p>
       <w:pPr>
         <w:pStyle w:val="FirstParagraph"/>
@@ -41616,7 +41851,7 @@
           <w:b/>
           <w:bCs/>
         </w:rPr>
-        <w:t xml:space="preserve">Exercise 18 (Linear Taylor polynomial of the exponential)</w:t>
+        <w:t xml:space="preserve">Exercise 21 (Linear Taylor polynomial of the exponential)</w:t>
       </w:r>
       <w:r>
         <w:t xml:space="preserve"> </w:t>
@@ -41727,8 +41962,8 @@
         <w:t xml:space="preserve">.</w:t>
       </w:r>
     </w:p>
-    <w:bookmarkEnd w:id="154"/>
-    <w:bookmarkStart w:id="155" w:name="sol-miller-taylor-exp-base"/>
+    <w:bookmarkEnd w:id="162"/>
+    <w:bookmarkStart w:id="163" w:name="sol-miller-taylor-exp-base"/>
     <w:p>
       <w:pPr>
         <w:pStyle w:val="BodyText"/>
@@ -41738,7 +41973,7 @@
           <w:i/>
           <w:iCs/>
         </w:rPr>
-        <w:t xml:space="preserve">Solution 18</w:t>
+        <w:t xml:space="preserve">Solution 21</w:t>
       </w:r>
       <w:r>
         <w:t xml:space="preserve">. </w:t>
@@ -42251,8 +42486,8 @@
         </m:oMath>
       </m:oMathPara>
     </w:p>
-    <w:bookmarkEnd w:id="155"/>
-    <w:bookmarkStart w:id="156" w:name="exr-miller-taylor-exp-power"/>
+    <w:bookmarkEnd w:id="163"/>
+    <w:bookmarkStart w:id="164" w:name="exr-miller-taylor-exp-power"/>
     <w:p>
       <w:pPr>
         <w:pStyle w:val="FirstParagraph"/>
@@ -42262,7 +42497,7 @@
           <w:b/>
           <w:bCs/>
         </w:rPr>
-        <w:t xml:space="preserve">Exercise 19 (Taylor series of a composite exponential)</w:t>
+        <w:t xml:space="preserve">Exercise 22 (Taylor series of a composite exponential)</w:t>
       </w:r>
       <w:r>
         <w:t xml:space="preserve"> </w:t>
@@ -42395,8 +42630,8 @@
         <w:t xml:space="preserve">.</w:t>
       </w:r>
     </w:p>
-    <w:bookmarkEnd w:id="156"/>
-    <w:bookmarkStart w:id="157" w:name="sol-miller-taylor-exp-power"/>
+    <w:bookmarkEnd w:id="164"/>
+    <w:bookmarkStart w:id="165" w:name="sol-miller-taylor-exp-power"/>
     <w:p>
       <w:pPr>
         <w:pStyle w:val="BodyText"/>
@@ -42406,7 +42641,7 @@
           <w:i/>
           <w:iCs/>
         </w:rPr>
-        <w:t xml:space="preserve">Solution 19</w:t>
+        <w:t xml:space="preserve">Solution 22</w:t>
       </w:r>
       <w:r>
         <w:t xml:space="preserve">. </w:t>
@@ -42936,8 +43171,8 @@
         </m:oMath>
       </m:oMathPara>
     </w:p>
-    <w:bookmarkEnd w:id="157"/>
-    <w:bookmarkStart w:id="158" w:name="exr-miller-taylor-normal-density"/>
+    <w:bookmarkEnd w:id="165"/>
+    <w:bookmarkStart w:id="166" w:name="exr-miller-taylor-normal-density"/>
     <w:p>
       <w:pPr>
         <w:pStyle w:val="FirstParagraph"/>
@@ -42947,7 +43182,7 @@
           <w:b/>
           <w:bCs/>
         </w:rPr>
-        <w:t xml:space="preserve">Exercise 20 (Taylor expansion of the normal density)</w:t>
+        <w:t xml:space="preserve">Exercise 23 (Taylor expansion of the normal density)</w:t>
       </w:r>
       <w:r>
         <w:t xml:space="preserve"> </w:t>
@@ -43124,8 +43359,8 @@
         <w:t xml:space="preserve">.</w:t>
       </w:r>
     </w:p>
-    <w:bookmarkEnd w:id="158"/>
-    <w:bookmarkStart w:id="159" w:name="sol-miller-taylor-normal-density"/>
+    <w:bookmarkEnd w:id="166"/>
+    <w:bookmarkStart w:id="167" w:name="sol-miller-taylor-normal-density"/>
     <w:p>
       <w:pPr>
         <w:pStyle w:val="BodyText"/>
@@ -43135,7 +43370,7 @@
           <w:i/>
           <w:iCs/>
         </w:rPr>
-        <w:t xml:space="preserve">Solution 20</w:t>
+        <w:t xml:space="preserve">Solution 23</w:t>
       </w:r>
       <w:r>
         <w:t xml:space="preserve">. </w:t>
@@ -43699,8 +43934,8 @@
         </m:oMath>
       </m:oMathPara>
     </w:p>
-    <w:bookmarkEnd w:id="159"/>
-    <w:bookmarkStart w:id="160" w:name="thm-taylor-normal-density"/>
+    <w:bookmarkEnd w:id="167"/>
+    <w:bookmarkStart w:id="168" w:name="thm-taylor-normal-density"/>
     <w:p>
       <w:pPr>
         <w:pStyle w:val="FirstParagraph"/>
@@ -43958,7 +44193,7 @@
         </m:oMath>
       </m:oMathPara>
     </w:p>
-    <w:bookmarkEnd w:id="160"/>
+    <w:bookmarkEnd w:id="168"/>
     <w:p>
       <w:pPr>
         <w:pStyle w:val="FirstParagraph"/>
@@ -43984,7 +44219,7 @@
           <w:rPr>
             <w:rStyle w:val="Hyperlink"/>
           </w:rPr>
-          <w:t xml:space="preserve">Exercise 20</w:t>
+          <w:t xml:space="preserve">Exercise 23</w:t>
         </w:r>
       </w:hyperlink>
       <w:r>
@@ -43998,14 +44233,14 @@
           <w:rPr>
             <w:rStyle w:val="Hyperlink"/>
           </w:rPr>
-          <w:t xml:space="preserve">Solution 20</w:t>
+          <w:t xml:space="preserve">Solution 23</w:t>
         </w:r>
       </w:hyperlink>
       <w:r>
         <w:t xml:space="preserve">.</w:t>
       </w:r>
     </w:p>
-    <w:bookmarkStart w:id="161" w:name="exr-miller-taylor-sqrt"/>
+    <w:bookmarkStart w:id="169" w:name="exr-miller-taylor-sqrt"/>
     <w:p>
       <w:pPr>
         <w:pStyle w:val="BodyText"/>
@@ -44015,7 +44250,7 @@
           <w:b/>
           <w:bCs/>
         </w:rPr>
-        <w:t xml:space="preserve">Exercise 21 (Taylor expansion of the square root)</w:t>
+        <w:t xml:space="preserve">Exercise 24 (Taylor expansion of the square root)</w:t>
       </w:r>
       <w:r>
         <w:t xml:space="preserve"> </w:t>
@@ -44134,8 +44369,8 @@
         <w:t xml:space="preserve">.</w:t>
       </w:r>
     </w:p>
-    <w:bookmarkEnd w:id="161"/>
-    <w:bookmarkStart w:id="162" w:name="sol-miller-taylor-sqrt"/>
+    <w:bookmarkEnd w:id="169"/>
+    <w:bookmarkStart w:id="170" w:name="sol-miller-taylor-sqrt"/>
     <w:p>
       <w:pPr>
         <w:pStyle w:val="BodyText"/>
@@ -44145,7 +44380,7 @@
           <w:i/>
           <w:iCs/>
         </w:rPr>
-        <w:t xml:space="preserve">Solution 21</w:t>
+        <w:t xml:space="preserve">Solution 24</w:t>
       </w:r>
       <w:r>
         <w:t xml:space="preserve">. </w:t>
@@ -45015,8 +45250,8 @@
         </m:oMath>
       </m:oMathPara>
     </w:p>
-    <w:bookmarkEnd w:id="162"/>
-    <w:bookmarkStart w:id="163" w:name="exr-miller-taylor-cube-root"/>
+    <w:bookmarkEnd w:id="170"/>
+    <w:bookmarkStart w:id="171" w:name="exr-miller-taylor-cube-root"/>
     <w:p>
       <w:pPr>
         <w:pStyle w:val="FirstParagraph"/>
@@ -45026,7 +45261,7 @@
           <w:b/>
           <w:bCs/>
         </w:rPr>
-        <w:t xml:space="preserve">Exercise 22 (Taylor expansion of a fractional power)</w:t>
+        <w:t xml:space="preserve">Exercise 25 (Taylor expansion of a fractional power)</w:t>
       </w:r>
       <w:r>
         <w:t xml:space="preserve"> </w:t>
@@ -45176,8 +45411,8 @@
         <w:t xml:space="preserve">.</w:t>
       </w:r>
     </w:p>
-    <w:bookmarkEnd w:id="163"/>
-    <w:bookmarkStart w:id="164" w:name="sol-miller-taylor-cube-root"/>
+    <w:bookmarkEnd w:id="171"/>
+    <w:bookmarkStart w:id="172" w:name="sol-miller-taylor-cube-root"/>
     <w:p>
       <w:pPr>
         <w:pStyle w:val="BodyText"/>
@@ -45187,7 +45422,7 @@
           <w:i/>
           <w:iCs/>
         </w:rPr>
-        <w:t xml:space="preserve">Solution 22</w:t>
+        <w:t xml:space="preserve">Solution 25</w:t>
       </w:r>
       <w:r>
         <w:t xml:space="preserve">. </w:t>
@@ -46489,8 +46724,8 @@
         </m:oMath>
       </m:oMathPara>
     </w:p>
-    <w:bookmarkEnd w:id="164"/>
-    <w:bookmarkStart w:id="165" w:name="exr-miller-taylor-x-log-x"/>
+    <w:bookmarkEnd w:id="172"/>
+    <w:bookmarkStart w:id="173" w:name="exr-miller-taylor-x-log-x"/>
     <w:p>
       <w:pPr>
         <w:pStyle w:val="FirstParagraph"/>
@@ -46500,7 +46735,7 @@
           <w:b/>
           <w:bCs/>
         </w:rPr>
-        <w:t xml:space="preserve">Exercise 23 (Taylor expansion of</w:t>
+        <w:t xml:space="preserve">Exercise 26 (Taylor expansion of</w:t>
       </w:r>
       <w:r>
         <w:rPr>
@@ -46639,8 +46874,8 @@
         <w:t xml:space="preserve">.</w:t>
       </w:r>
     </w:p>
-    <w:bookmarkEnd w:id="165"/>
-    <w:bookmarkStart w:id="166" w:name="sol-miller-taylor-x-log-x"/>
+    <w:bookmarkEnd w:id="173"/>
+    <w:bookmarkStart w:id="174" w:name="sol-miller-taylor-x-log-x"/>
     <w:p>
       <w:pPr>
         <w:pStyle w:val="BodyText"/>
@@ -46650,7 +46885,7 @@
           <w:i/>
           <w:iCs/>
         </w:rPr>
-        <w:t xml:space="preserve">Solution 23</w:t>
+        <w:t xml:space="preserve">Solution 26</w:t>
       </w:r>
       <w:r>
         <w:t xml:space="preserve">. </w:t>
@@ -47304,8 +47539,8 @@
         </m:oMath>
       </m:oMathPara>
     </w:p>
-    <w:bookmarkEnd w:id="166"/>
-    <w:bookmarkStart w:id="167" w:name="exr-miller-taylor-log-one-plus-x"/>
+    <w:bookmarkEnd w:id="174"/>
+    <w:bookmarkStart w:id="175" w:name="exr-miller-taylor-log-one-plus-x"/>
     <w:p>
       <w:pPr>
         <w:pStyle w:val="FirstParagraph"/>
@@ -47315,7 +47550,7 @@
           <w:b/>
           <w:bCs/>
         </w:rPr>
-        <w:t xml:space="preserve">Exercise 24 (Maclaurin series of</w:t>
+        <w:t xml:space="preserve">Exercise 27 (Maclaurin series of</w:t>
       </w:r>
       <w:r>
         <w:rPr>
@@ -47490,8 +47725,8 @@
         <w:t xml:space="preserve">.</w:t>
       </w:r>
     </w:p>
-    <w:bookmarkEnd w:id="167"/>
-    <w:bookmarkStart w:id="168" w:name="sol-miller-taylor-log-one-plus-x"/>
+    <w:bookmarkEnd w:id="175"/>
+    <w:bookmarkStart w:id="176" w:name="sol-miller-taylor-log-one-plus-x"/>
     <w:p>
       <w:pPr>
         <w:pStyle w:val="BodyText"/>
@@ -47501,7 +47736,7 @@
           <w:i/>
           <w:iCs/>
         </w:rPr>
-        <w:t xml:space="preserve">Solution 24</w:t>
+        <w:t xml:space="preserve">Solution 27</w:t>
       </w:r>
       <w:r>
         <w:t xml:space="preserve">. </w:t>
@@ -48111,8 +48346,8 @@
         </m:oMath>
       </m:oMathPara>
     </w:p>
-    <w:bookmarkEnd w:id="168"/>
-    <w:bookmarkStart w:id="169" w:name="thm-taylor-log-one-plus-x"/>
+    <w:bookmarkEnd w:id="176"/>
+    <w:bookmarkStart w:id="177" w:name="thm-taylor-log-one-plus-x"/>
     <w:p>
       <w:pPr>
         <w:pStyle w:val="FirstParagraph"/>
@@ -48361,7 +48596,7 @@
         </m:oMath>
       </m:oMathPara>
     </w:p>
-    <w:bookmarkEnd w:id="169"/>
+    <w:bookmarkEnd w:id="177"/>
     <w:p>
       <w:pPr>
         <w:pStyle w:val="FirstParagraph"/>
@@ -48387,7 +48622,7 @@
           <w:rPr>
             <w:rStyle w:val="Hyperlink"/>
           </w:rPr>
-          <w:t xml:space="preserve">Exercise 24</w:t>
+          <w:t xml:space="preserve">Exercise 27</w:t>
         </w:r>
       </w:hyperlink>
       <w:r>
@@ -48401,14 +48636,14 @@
           <w:rPr>
             <w:rStyle w:val="Hyperlink"/>
           </w:rPr>
-          <w:t xml:space="preserve">Solution 24</w:t>
+          <w:t xml:space="preserve">Solution 27</w:t>
         </w:r>
       </w:hyperlink>
       <w:r>
         <w:t xml:space="preserve">.</w:t>
       </w:r>
     </w:p>
-    <w:bookmarkStart w:id="170" w:name="exr-miller-taylor-log-one-minus-x"/>
+    <w:bookmarkStart w:id="178" w:name="exr-miller-taylor-log-one-minus-x"/>
     <w:p>
       <w:pPr>
         <w:pStyle w:val="BodyText"/>
@@ -48418,7 +48653,7 @@
           <w:b/>
           <w:bCs/>
         </w:rPr>
-        <w:t xml:space="preserve">Exercise 25 (Maclaurin series of</w:t>
+        <w:t xml:space="preserve">Exercise 28 (Maclaurin series of</w:t>
       </w:r>
       <w:r>
         <w:rPr>
@@ -48593,8 +48828,8 @@
         <w:t xml:space="preserve">.</w:t>
       </w:r>
     </w:p>
-    <w:bookmarkEnd w:id="170"/>
-    <w:bookmarkStart w:id="171" w:name="sol-miller-taylor-log-one-minus-x"/>
+    <w:bookmarkEnd w:id="178"/>
+    <w:bookmarkStart w:id="179" w:name="sol-miller-taylor-log-one-minus-x"/>
     <w:p>
       <w:pPr>
         <w:pStyle w:val="BodyText"/>
@@ -48604,7 +48839,7 @@
           <w:i/>
           <w:iCs/>
         </w:rPr>
-        <w:t xml:space="preserve">Solution 25</w:t>
+        <w:t xml:space="preserve">Solution 28</w:t>
       </w:r>
       <w:r>
         <w:t xml:space="preserve">. </w:t>
@@ -48973,8 +49208,8 @@
         </m:oMath>
       </m:oMathPara>
     </w:p>
-    <w:bookmarkEnd w:id="171"/>
-    <w:bookmarkStart w:id="172" w:name="thm-taylor-log-one-minus-x"/>
+    <w:bookmarkEnd w:id="179"/>
+    <w:bookmarkStart w:id="180" w:name="thm-taylor-log-one-minus-x"/>
     <w:p>
       <w:pPr>
         <w:pStyle w:val="FirstParagraph"/>
@@ -49229,7 +49464,7 @@
         </m:oMath>
       </m:oMathPara>
     </w:p>
-    <w:bookmarkEnd w:id="172"/>
+    <w:bookmarkEnd w:id="180"/>
     <w:p>
       <w:pPr>
         <w:pStyle w:val="FirstParagraph"/>
@@ -49255,7 +49490,7 @@
           <w:rPr>
             <w:rStyle w:val="Hyperlink"/>
           </w:rPr>
-          <w:t xml:space="preserve">Exercise 25</w:t>
+          <w:t xml:space="preserve">Exercise 28</w:t>
         </w:r>
       </w:hyperlink>
       <w:r>
@@ -49269,14 +49504,14 @@
           <w:rPr>
             <w:rStyle w:val="Hyperlink"/>
           </w:rPr>
-          <w:t xml:space="preserve">Solution 25</w:t>
+          <w:t xml:space="preserve">Solution 28</w:t>
         </w:r>
       </w:hyperlink>
       <w:r>
         <w:t xml:space="preserve">.</w:t>
       </w:r>
     </w:p>
-    <w:bookmarkStart w:id="173" w:name="exr-miller-taylor-log-product-exp"/>
+    <w:bookmarkStart w:id="181" w:name="exr-miller-taylor-log-product-exp"/>
     <w:p>
       <w:pPr>
         <w:pStyle w:val="BodyText"/>
@@ -49286,7 +49521,7 @@
           <w:b/>
           <w:bCs/>
         </w:rPr>
-        <w:t xml:space="preserve">Exercise 26 (Taylor series of</w:t>
+        <w:t xml:space="preserve">Exercise 29 (Taylor series of</w:t>
       </w:r>
       <w:r>
         <w:rPr>
@@ -49509,8 +49744,8 @@
         <w:t xml:space="preserve">.</w:t>
       </w:r>
     </w:p>
-    <w:bookmarkEnd w:id="173"/>
-    <w:bookmarkStart w:id="174" w:name="sol-miller-taylor-log-product-exp"/>
+    <w:bookmarkEnd w:id="181"/>
+    <w:bookmarkStart w:id="182" w:name="sol-miller-taylor-log-product-exp"/>
     <w:p>
       <w:pPr>
         <w:pStyle w:val="BodyText"/>
@@ -49520,7 +49755,7 @@
           <w:i/>
           <w:iCs/>
         </w:rPr>
-        <w:t xml:space="preserve">Solution 26</w:t>
+        <w:t xml:space="preserve">Solution 29</w:t>
       </w:r>
       <w:r>
         <w:t xml:space="preserve">. </w:t>
@@ -50142,8 +50377,8 @@
         </m:oMath>
       </m:oMathPara>
     </w:p>
-    <w:bookmarkEnd w:id="174"/>
-    <w:bookmarkStart w:id="175" w:name="exr-miller-taylor-product-cos-log"/>
+    <w:bookmarkEnd w:id="182"/>
+    <w:bookmarkStart w:id="183" w:name="exr-miller-taylor-product-cos-log"/>
     <w:p>
       <w:pPr>
         <w:pStyle w:val="FirstParagraph"/>
@@ -50153,7 +50388,7 @@
           <w:b/>
           <w:bCs/>
         </w:rPr>
-        <w:t xml:space="preserve">Exercise 27 (Taylor series of a product of known expansions)</w:t>
+        <w:t xml:space="preserve">Exercise 30 (Taylor series of a product of known expansions)</w:t>
       </w:r>
       <w:r>
         <w:t xml:space="preserve"> </w:t>
@@ -50303,8 +50538,8 @@
         <w:t xml:space="preserve">.</w:t>
       </w:r>
     </w:p>
-    <w:bookmarkEnd w:id="175"/>
-    <w:bookmarkStart w:id="176" w:name="sol-miller-taylor-product-cos-log"/>
+    <w:bookmarkEnd w:id="183"/>
+    <w:bookmarkStart w:id="184" w:name="sol-miller-taylor-product-cos-log"/>
     <w:p>
       <w:pPr>
         <w:pStyle w:val="BodyText"/>
@@ -50314,7 +50549,7 @@
           <w:i/>
           <w:iCs/>
         </w:rPr>
-        <w:t xml:space="preserve">Solution 27</w:t>
+        <w:t xml:space="preserve">Solution 30</w:t>
       </w:r>
       <w:r>
         <w:t xml:space="preserve">. </w:t>
@@ -50803,8 +51038,8 @@
         </m:oMath>
       </m:oMathPara>
     </w:p>
-    <w:bookmarkEnd w:id="176"/>
-    <w:bookmarkStart w:id="177" w:name="exr-miller-taylor-log-scaled"/>
+    <w:bookmarkEnd w:id="184"/>
+    <w:bookmarkStart w:id="185" w:name="exr-miller-taylor-log-scaled"/>
     <w:p>
       <w:pPr>
         <w:pStyle w:val="FirstParagraph"/>
@@ -50814,7 +51049,7 @@
           <w:b/>
           <w:bCs/>
         </w:rPr>
-        <w:t xml:space="preserve">Exercise 28 (Taylor series of</w:t>
+        <w:t xml:space="preserve">Exercise 31 (Taylor series of</w:t>
       </w:r>
       <w:r>
         <w:rPr>
@@ -50995,8 +51230,8 @@
         <w:t xml:space="preserve">.</w:t>
       </w:r>
     </w:p>
-    <w:bookmarkEnd w:id="177"/>
-    <w:bookmarkStart w:id="178" w:name="sol-miller-taylor-log-scaled"/>
+    <w:bookmarkEnd w:id="185"/>
+    <w:bookmarkStart w:id="186" w:name="sol-miller-taylor-log-scaled"/>
     <w:p>
       <w:pPr>
         <w:pStyle w:val="BodyText"/>
@@ -51006,7 +51241,7 @@
           <w:i/>
           <w:iCs/>
         </w:rPr>
-        <w:t xml:space="preserve">Solution 28</w:t>
+        <w:t xml:space="preserve">Solution 31</w:t>
       </w:r>
       <w:r>
         <w:t xml:space="preserve">. </w:t>
@@ -51313,9 +51548,9 @@
         </m:oMath>
       </m:oMathPara>
     </w:p>
-    <w:bookmarkEnd w:id="178"/>
-    <w:bookmarkStart w:id="209" w:name="refs"/>
-    <w:bookmarkStart w:id="180" w:name="ref-wikipedia_limit_of_a_function"/>
+    <w:bookmarkEnd w:id="186"/>
+    <w:bookmarkStart w:id="217" w:name="refs"/>
+    <w:bookmarkStart w:id="188" w:name="ref-wikipedia_limit_of_a_function"/>
     <w:p>
       <w:pPr>
         <w:pStyle w:val="Bibliography"/>
@@ -51362,7 +51597,7 @@
       <w:r>
         <w:t xml:space="preserve"> </w:t>
       </w:r>
-      <w:hyperlink r:id="rId179">
+      <w:hyperlink r:id="rId187">
         <w:r>
           <w:rPr>
             <w:rStyle w:val="Hyperlink"/>
@@ -51371,8 +51606,8 @@
         </w:r>
       </w:hyperlink>
     </w:p>
-    <w:bookmarkEnd w:id="180"/>
-    <w:bookmarkStart w:id="182" w:name="ref-wikipedia_one_sided_limit"/>
+    <w:bookmarkEnd w:id="188"/>
+    <w:bookmarkStart w:id="190" w:name="ref-wikipedia_one_sided_limit"/>
     <w:p>
       <w:pPr>
         <w:pStyle w:val="Bibliography"/>
@@ -51419,7 +51654,7 @@
       <w:r>
         <w:t xml:space="preserve"> </w:t>
       </w:r>
-      <w:hyperlink r:id="rId181">
+      <w:hyperlink r:id="rId189">
         <w:r>
           <w:rPr>
             <w:rStyle w:val="Hyperlink"/>
@@ -51428,8 +51663,8 @@
         </w:r>
       </w:hyperlink>
     </w:p>
-    <w:bookmarkEnd w:id="182"/>
-    <w:bookmarkStart w:id="184" w:name="ref-wikipedia_difference_quotient"/>
+    <w:bookmarkEnd w:id="190"/>
+    <w:bookmarkStart w:id="192" w:name="ref-wikipedia_difference_quotient"/>
     <w:p>
       <w:pPr>
         <w:pStyle w:val="Bibliography"/>
@@ -51476,7 +51711,7 @@
       <w:r>
         <w:t xml:space="preserve"> </w:t>
       </w:r>
-      <w:hyperlink r:id="rId183">
+      <w:hyperlink r:id="rId191">
         <w:r>
           <w:rPr>
             <w:rStyle w:val="Hyperlink"/>
@@ -51485,8 +51720,8 @@
         </w:r>
       </w:hyperlink>
     </w:p>
-    <w:bookmarkEnd w:id="184"/>
-    <w:bookmarkStart w:id="186" w:name="ref-wikipedia_differentiable_function"/>
+    <w:bookmarkEnd w:id="192"/>
+    <w:bookmarkStart w:id="194" w:name="ref-wikipedia_differentiable_function"/>
     <w:p>
       <w:pPr>
         <w:pStyle w:val="Bibliography"/>
@@ -51533,7 +51768,7 @@
       <w:r>
         <w:t xml:space="preserve"> </w:t>
       </w:r>
-      <w:hyperlink r:id="rId185">
+      <w:hyperlink r:id="rId193">
         <w:r>
           <w:rPr>
             <w:rStyle w:val="Hyperlink"/>
@@ -51542,8 +51777,8 @@
         </w:r>
       </w:hyperlink>
     </w:p>
-    <w:bookmarkEnd w:id="186"/>
-    <w:bookmarkStart w:id="188" w:name="ref-larsonCalc11e"/>
+    <w:bookmarkEnd w:id="194"/>
+    <w:bookmarkStart w:id="196" w:name="ref-larsonCalc11e"/>
     <w:p>
       <w:pPr>
         <w:pStyle w:val="Bibliography"/>
@@ -51576,7 +51811,7 @@
       <w:r>
         <w:t xml:space="preserve"> </w:t>
       </w:r>
-      <w:hyperlink r:id="rId187">
+      <w:hyperlink r:id="rId195">
         <w:r>
           <w:rPr>
             <w:rStyle w:val="Hyperlink"/>
@@ -51585,8 +51820,8 @@
         </w:r>
       </w:hyperlink>
     </w:p>
-    <w:bookmarkEnd w:id="188"/>
-    <w:bookmarkStart w:id="190" w:name="ref-wikipedia_derivative"/>
+    <w:bookmarkEnd w:id="196"/>
+    <w:bookmarkStart w:id="198" w:name="ref-wikipedia_derivative"/>
     <w:p>
       <w:pPr>
         <w:pStyle w:val="Bibliography"/>
@@ -51633,7 +51868,7 @@
       <w:r>
         <w:t xml:space="preserve"> </w:t>
       </w:r>
-      <w:hyperlink r:id="rId189">
+      <w:hyperlink r:id="rId197">
         <w:r>
           <w:rPr>
             <w:rStyle w:val="Hyperlink"/>
@@ -51642,8 +51877,8 @@
         </w:r>
       </w:hyperlink>
     </w:p>
-    <w:bookmarkEnd w:id="190"/>
-    <w:bookmarkStart w:id="192" w:name="Xce9848c2f4a380db4acb3f03ebf9e8cf213ef4a"/>
+    <w:bookmarkEnd w:id="198"/>
+    <w:bookmarkStart w:id="200" w:name="Xce9848c2f4a380db4acb3f03ebf9e8cf213ef4a"/>
     <w:p>
       <w:pPr>
         <w:pStyle w:val="Bibliography"/>
@@ -51690,7 +51925,7 @@
       <w:r>
         <w:t xml:space="preserve"> </w:t>
       </w:r>
-      <w:hyperlink r:id="rId191">
+      <w:hyperlink r:id="rId199">
         <w:r>
           <w:rPr>
             <w:rStyle w:val="Hyperlink"/>
@@ -51699,8 +51934,8 @@
         </w:r>
       </w:hyperlink>
     </w:p>
-    <w:bookmarkEnd w:id="192"/>
-    <w:bookmarkStart w:id="194" w:name="ref-wikipedia_second_derivative"/>
+    <w:bookmarkEnd w:id="200"/>
+    <w:bookmarkStart w:id="202" w:name="ref-wikipedia_second_derivative"/>
     <w:p>
       <w:pPr>
         <w:pStyle w:val="Bibliography"/>
@@ -51747,7 +51982,7 @@
       <w:r>
         <w:t xml:space="preserve"> </w:t>
       </w:r>
-      <w:hyperlink r:id="rId193">
+      <w:hyperlink r:id="rId201">
         <w:r>
           <w:rPr>
             <w:rStyle w:val="Hyperlink"/>
@@ -51756,8 +51991,8 @@
         </w:r>
       </w:hyperlink>
     </w:p>
-    <w:bookmarkEnd w:id="194"/>
-    <w:bookmarkStart w:id="196" w:name="ref-wikipedia_power_rule"/>
+    <w:bookmarkEnd w:id="202"/>
+    <w:bookmarkStart w:id="204" w:name="ref-wikipedia_power_rule"/>
     <w:p>
       <w:pPr>
         <w:pStyle w:val="Bibliography"/>
@@ -51804,7 +52039,7 @@
       <w:r>
         <w:t xml:space="preserve"> </w:t>
       </w:r>
-      <w:hyperlink r:id="rId195">
+      <w:hyperlink r:id="rId203">
         <w:r>
           <w:rPr>
             <w:rStyle w:val="Hyperlink"/>
@@ -51813,8 +52048,8 @@
         </w:r>
       </w:hyperlink>
     </w:p>
-    <w:bookmarkEnd w:id="196"/>
-    <w:bookmarkStart w:id="198" w:name="ref-problifesavercalc"/>
+    <w:bookmarkEnd w:id="204"/>
+    <w:bookmarkStart w:id="206" w:name="ref-problifesavercalc"/>
     <w:p>
       <w:pPr>
         <w:pStyle w:val="Bibliography"/>
@@ -51847,7 +52082,7 @@
       <w:r>
         <w:t xml:space="preserve"> </w:t>
       </w:r>
-      <w:hyperlink r:id="rId197">
+      <w:hyperlink r:id="rId205">
         <w:r>
           <w:rPr>
             <w:rStyle w:val="Hyperlink"/>
@@ -51856,8 +52091,8 @@
         </w:r>
       </w:hyperlink>
     </w:p>
-    <w:bookmarkEnd w:id="198"/>
-    <w:bookmarkStart w:id="200" w:name="ref-wikipedia_product_rule"/>
+    <w:bookmarkEnd w:id="206"/>
+    <w:bookmarkStart w:id="208" w:name="ref-wikipedia_product_rule"/>
     <w:p>
       <w:pPr>
         <w:pStyle w:val="Bibliography"/>
@@ -51904,7 +52139,7 @@
       <w:r>
         <w:t xml:space="preserve"> </w:t>
       </w:r>
-      <w:hyperlink r:id="rId199">
+      <w:hyperlink r:id="rId207">
         <w:r>
           <w:rPr>
             <w:rStyle w:val="Hyperlink"/>
@@ -51913,8 +52148,8 @@
         </w:r>
       </w:hyperlink>
     </w:p>
-    <w:bookmarkEnd w:id="200"/>
-    <w:bookmarkStart w:id="202" w:name="ref-wikipedia_quotient_rule"/>
+    <w:bookmarkEnd w:id="208"/>
+    <w:bookmarkStart w:id="210" w:name="ref-wikipedia_quotient_rule"/>
     <w:p>
       <w:pPr>
         <w:pStyle w:val="Bibliography"/>
@@ -51961,7 +52196,7 @@
       <w:r>
         <w:t xml:space="preserve"> </w:t>
       </w:r>
-      <w:hyperlink r:id="rId201">
+      <w:hyperlink r:id="rId209">
         <w:r>
           <w:rPr>
             <w:rStyle w:val="Hyperlink"/>
@@ -51970,8 +52205,8 @@
         </w:r>
       </w:hyperlink>
     </w:p>
-    <w:bookmarkEnd w:id="202"/>
-    <w:bookmarkStart w:id="204" w:name="ref-wikipedia_chain_rule"/>
+    <w:bookmarkEnd w:id="210"/>
+    <w:bookmarkStart w:id="212" w:name="ref-wikipedia_chain_rule"/>
     <w:p>
       <w:pPr>
         <w:pStyle w:val="Bibliography"/>
@@ -52018,7 +52253,7 @@
       <w:r>
         <w:t xml:space="preserve"> </w:t>
       </w:r>
-      <w:hyperlink r:id="rId203">
+      <w:hyperlink r:id="rId211">
         <w:r>
           <w:rPr>
             <w:rStyle w:val="Hyperlink"/>
@@ -52027,8 +52262,8 @@
         </w:r>
       </w:hyperlink>
     </w:p>
-    <w:bookmarkEnd w:id="204"/>
-    <w:bookmarkStart w:id="206" w:name="ref-wikipedia_linear_approximation"/>
+    <w:bookmarkEnd w:id="212"/>
+    <w:bookmarkStart w:id="214" w:name="ref-wikipedia_linear_approximation"/>
     <w:p>
       <w:pPr>
         <w:pStyle w:val="Bibliography"/>
@@ -52075,7 +52310,7 @@
       <w:r>
         <w:t xml:space="preserve"> </w:t>
       </w:r>
-      <w:hyperlink r:id="rId205">
+      <w:hyperlink r:id="rId213">
         <w:r>
           <w:rPr>
             <w:rStyle w:val="Hyperlink"/>
@@ -52084,8 +52319,8 @@
         </w:r>
       </w:hyperlink>
     </w:p>
-    <w:bookmarkEnd w:id="206"/>
-    <w:bookmarkStart w:id="208" w:name="ref-boyd2018vmls"/>
+    <w:bookmarkEnd w:id="214"/>
+    <w:bookmarkStart w:id="216" w:name="ref-boyd2018vmls"/>
     <w:p>
       <w:pPr>
         <w:pStyle w:val="Bibliography"/>
@@ -52118,7 +52353,7 @@
       <w:r>
         <w:t xml:space="preserve"> </w:t>
       </w:r>
-      <w:hyperlink r:id="rId207">
+      <w:hyperlink r:id="rId215">
         <w:r>
           <w:rPr>
             <w:rStyle w:val="Hyperlink"/>
@@ -52130,10 +52365,10 @@
         <w:t xml:space="preserve">.</w:t>
       </w:r>
     </w:p>
-    <w:bookmarkEnd w:id="208"/>
-    <w:bookmarkEnd w:id="209"/>
-    <w:bookmarkEnd w:id="210"/>
-    <w:bookmarkEnd w:id="211"/>
+    <w:bookmarkEnd w:id="216"/>
+    <w:bookmarkEnd w:id="217"/>
+    <w:bookmarkEnd w:id="218"/>
+    <w:bookmarkEnd w:id="219"/>
     <w:sectPr>
       <w:footnotePr>
         <w:numRestart w:val="eachSect"/>
@@ -52502,36 +52737,6 @@
     <w:abstractNumId w:val="991"/>
   </w:num>
   <w:num w:numId="1014">
-    <w:abstractNumId w:val="99411"/>
-    <w:lvlOverride w:ilvl="0">
-      <w:startOverride w:val="1"/>
-    </w:lvlOverride>
-    <w:lvlOverride w:ilvl="1">
-      <w:startOverride w:val="1"/>
-    </w:lvlOverride>
-    <w:lvlOverride w:ilvl="2">
-      <w:startOverride w:val="1"/>
-    </w:lvlOverride>
-    <w:lvlOverride w:ilvl="3">
-      <w:startOverride w:val="1"/>
-    </w:lvlOverride>
-    <w:lvlOverride w:ilvl="4">
-      <w:startOverride w:val="1"/>
-    </w:lvlOverride>
-    <w:lvlOverride w:ilvl="5">
-      <w:startOverride w:val="1"/>
-    </w:lvlOverride>
-    <w:lvlOverride w:ilvl="6">
-      <w:startOverride w:val="1"/>
-    </w:lvlOverride>
-    <w:lvlOverride w:ilvl="7">
-      <w:startOverride w:val="1"/>
-    </w:lvlOverride>
-    <w:lvlOverride w:ilvl="8">
-      <w:startOverride w:val="1"/>
-    </w:lvlOverride>
-  </w:num>
-  <w:num w:numId="1015">
     <w:abstractNumId w:val="991"/>
   </w:num>
 </w:numbering>

</xml_diff>